<commit_message>
Add 5 figures and 3 tables to laser_paper_final.docx with in-text references and captions
Agent-Logs-Url: https://github.com/MD8-DEV/zeovault/sessions/a97d4039-ec75-4efa-b1b7-1f5043178c71

Co-authored-by: MD8-DEV <74047396+MD8-DEV@users.noreply.github.com>
</commit_message>
<xml_diff>
--- a/laser_paper_final.docx
+++ b/laser_paper_final.docx
@@ -462,6 +462,71 @@
         </w:rPr>
         <w:t xml:space="preserve">Electrons occupy discrete energy levels. In spontaneous emission, an electron decays from an excited state E₂ to E₁, emitting a photon of frequency ν = (E₂ − E₁)/h, where Planck’s constant h = 6.626 × 10⁻³⁴ J·s. This process is incoherent and isotropic. Einstein (1917) predicted that a passing photon of identical energy could trigger stimulated emission, generating a second photon matched in phase, polarization, and direction. The Einstein A and B coefficients quantify the relative rates of spontaneous and stimulated processes; in the optical regime, stimulated emission dominates spontaneous emission only when a population inversion is established. Selection rules further constrain which transitions are allowed.</w:t>
       </w:r>
+      <w:r>
+        <w:t xml:space="preserve"> The three fundamental photon–atom interaction processes are illustrated in Figure 1.</w:t>
+      </w:r>
+    </w:p>
+    <w:p>
+      <w:pPr>
+        <w:spacing w:before="0" w:after="80"/>
+      </w:pPr>
+    </w:p>
+    <w:p>
+      <w:pPr>
+        <w:jc w:val="center"/>
+      </w:pPr>
+      <w:r>
+        <w:drawing>
+          <wp:inline xmlns:a="http://schemas.openxmlformats.org/drawingml/2006/main" xmlns:pic="http://schemas.openxmlformats.org/drawingml/2006/picture">
+            <wp:extent cx="5029200" cy="1935126"/>
+            <wp:docPr id="1" name="Picture 1"/>
+            <wp:cNvGraphicFramePr>
+              <a:graphicFrameLocks noChangeAspect="1"/>
+            </wp:cNvGraphicFramePr>
+            <a:graphic>
+              <a:graphicData uri="http://schemas.openxmlformats.org/drawingml/2006/picture">
+                <pic:pic>
+                  <pic:nvPicPr>
+                    <pic:cNvPr id="0" name="fig1_photon_interactions.png"/>
+                    <pic:cNvPicPr/>
+                  </pic:nvPicPr>
+                  <pic:blipFill>
+                    <a:blip r:embed="rId8"/>
+                    <a:stretch>
+                      <a:fillRect/>
+                    </a:stretch>
+                  </pic:blipFill>
+                  <pic:spPr>
+                    <a:xfrm>
+                      <a:off x="0" y="0"/>
+                      <a:ext cx="5029200" cy="1935126"/>
+                    </a:xfrm>
+                    <a:prstGeom prst="rect"/>
+                  </pic:spPr>
+                </pic:pic>
+              </a:graphicData>
+            </a:graphic>
+          </wp:inline>
+        </w:drawing>
+      </w:r>
+    </w:p>
+    <w:p>
+      <w:pPr>
+        <w:jc w:val="center"/>
+      </w:pPr>
+      <w:r>
+        <w:rPr>
+          <w:i/>
+          <w:color w:val="444444"/>
+          <w:sz w:val="17"/>
+        </w:rPr>
+        <w:t>Figure 1: The three photon–atom interaction processes: (a) absorption, (b) spontaneous emission, and (c) stimulated emission. In stimulated emission the incident photon triggers a second phase-matched photon — the basis of laser amplification.</w:t>
+      </w:r>
+    </w:p>
+    <w:p>
+      <w:pPr>
+        <w:spacing w:before="0" w:after="80"/>
+      </w:pPr>
     </w:p>
     <w:p>
       <w:pPr>
@@ -493,6 +558,71 @@
         </w:rPr>
         <w:t xml:space="preserve">Under thermal equilibrium, the Boltzmann distribution ensures that higher-energy levels are less populated. Achieving net gain requires a population inversion — more atoms in the upper laser level than the lower. Three-level systems (e.g., ruby) demand intense pumping because the lower laser level is the ground state; four-level systems (e.g., Nd:YAG) are inherently more efficient because the lower level lies above ground state and remains nearly empty at room temperature. Pumping may be optical (flashlamp, diode), electrical (gas discharge, semiconductor junction), or chemical. Metastable states with long radiative lifetimes — typically microseconds to milliseconds — facilitate the accumulation of inversion necessary for sustained gain (Svelto, 2010).</w:t>
       </w:r>
+      <w:r>
+        <w:t xml:space="preserve"> Figure 2 contrasts the three-level and four-level pumping architectures that underpin these efficiency differences.</w:t>
+      </w:r>
+    </w:p>
+    <w:p>
+      <w:pPr>
+        <w:spacing w:before="0" w:after="80"/>
+      </w:pPr>
+    </w:p>
+    <w:p>
+      <w:pPr>
+        <w:jc w:val="center"/>
+      </w:pPr>
+      <w:r>
+        <w:drawing>
+          <wp:inline xmlns:a="http://schemas.openxmlformats.org/drawingml/2006/main" xmlns:pic="http://schemas.openxmlformats.org/drawingml/2006/picture">
+            <wp:extent cx="5029200" cy="2110892"/>
+            <wp:docPr id="2" name="Picture 2"/>
+            <wp:cNvGraphicFramePr>
+              <a:graphicFrameLocks noChangeAspect="1"/>
+            </wp:cNvGraphicFramePr>
+            <a:graphic>
+              <a:graphicData uri="http://schemas.openxmlformats.org/drawingml/2006/picture">
+                <pic:pic>
+                  <pic:nvPicPr>
+                    <pic:cNvPr id="0" name="fig2_pumping_schemes.png"/>
+                    <pic:cNvPicPr/>
+                  </pic:nvPicPr>
+                  <pic:blipFill>
+                    <a:blip r:embed="rId9"/>
+                    <a:stretch>
+                      <a:fillRect/>
+                    </a:stretch>
+                  </pic:blipFill>
+                  <pic:spPr>
+                    <a:xfrm>
+                      <a:off x="0" y="0"/>
+                      <a:ext cx="5029200" cy="2110892"/>
+                    </a:xfrm>
+                    <a:prstGeom prst="rect"/>
+                  </pic:spPr>
+                </pic:pic>
+              </a:graphicData>
+            </a:graphic>
+          </wp:inline>
+        </w:drawing>
+      </w:r>
+    </w:p>
+    <w:p>
+      <w:pPr>
+        <w:jc w:val="center"/>
+      </w:pPr>
+      <w:r>
+        <w:rPr>
+          <w:i/>
+          <w:color w:val="444444"/>
+          <w:sz w:val="17"/>
+        </w:rPr>
+        <w:t>Figure 2: Comparison of (a) three-level (e.g., ruby) and (b) four-level (e.g., Nd:YAG) pumping schemes. In the four-level system the lower laser level lies above the ground state and remains essentially empty, enabling a lower pump threshold.</w:t>
+      </w:r>
+    </w:p>
+    <w:p>
+      <w:pPr>
+        <w:spacing w:before="0" w:after="80"/>
+      </w:pPr>
     </w:p>
     <w:p>
       <w:pPr>
@@ -524,6 +654,71 @@
         </w:rPr>
         <w:t xml:space="preserve">An optical cavity confines photons between a high reflector and a partially transmitting output coupler. Only longitudinal modes satisfying the round-trip phase condition 2nL = mλ oscillate stably. The threshold condition G²R₁R₂(1−α)² = 1 relates single-pass gain G, mirror reflectivities R, and internal losses α (Saleh &amp; Teich, 2019). The cavity geometry also selects transverse modes; the fundamental Gaussian mode (TEM₀₀) yields the smallest beam divergence and highest focusability. Q-switching and mode-locking modify the temporal output to produce giant nanosecond pulses or ultrashort femtosecond trains, respectively.</w:t>
       </w:r>
+      <w:r>
+        <w:t xml:space="preserve"> The principal components of a linear optical resonator are shown schematically in Figure 3.</w:t>
+      </w:r>
+    </w:p>
+    <w:p>
+      <w:pPr>
+        <w:spacing w:before="0" w:after="80"/>
+      </w:pPr>
+    </w:p>
+    <w:p>
+      <w:pPr>
+        <w:jc w:val="center"/>
+      </w:pPr>
+      <w:r>
+        <w:drawing>
+          <wp:inline xmlns:a="http://schemas.openxmlformats.org/drawingml/2006/main" xmlns:pic="http://schemas.openxmlformats.org/drawingml/2006/picture">
+            <wp:extent cx="5303520" cy="1928045"/>
+            <wp:docPr id="3" name="Picture 3"/>
+            <wp:cNvGraphicFramePr>
+              <a:graphicFrameLocks noChangeAspect="1"/>
+            </wp:cNvGraphicFramePr>
+            <a:graphic>
+              <a:graphicData uri="http://schemas.openxmlformats.org/drawingml/2006/picture">
+                <pic:pic>
+                  <pic:nvPicPr>
+                    <pic:cNvPr id="0" name="fig3_optical_cavity.png"/>
+                    <pic:cNvPicPr/>
+                  </pic:nvPicPr>
+                  <pic:blipFill>
+                    <a:blip r:embed="rId10"/>
+                    <a:stretch>
+                      <a:fillRect/>
+                    </a:stretch>
+                  </pic:blipFill>
+                  <pic:spPr>
+                    <a:xfrm>
+                      <a:off x="0" y="0"/>
+                      <a:ext cx="5303520" cy="1928045"/>
+                    </a:xfrm>
+                    <a:prstGeom prst="rect"/>
+                  </pic:spPr>
+                </pic:pic>
+              </a:graphicData>
+            </a:graphic>
+          </wp:inline>
+        </w:drawing>
+      </w:r>
+    </w:p>
+    <w:p>
+      <w:pPr>
+        <w:jc w:val="center"/>
+      </w:pPr>
+      <w:r>
+        <w:rPr>
+          <w:i/>
+          <w:color w:val="444444"/>
+          <w:sz w:val="17"/>
+        </w:rPr>
+        <w:t>Figure 3: Linear optical resonator showing the high-reflectivity rear mirror (R₁ ≈ 100%), the active gain medium, and the partially transmitting output coupler (R₂ &lt; 100%). The round-trip resonance condition 2nL = mλ selects the allowed longitudinal modes.</w:t>
+      </w:r>
+    </w:p>
+    <w:p>
+      <w:pPr>
+        <w:spacing w:before="0" w:after="80"/>
+      </w:pPr>
     </w:p>
     <w:p>
       <w:pPr>
@@ -555,6 +750,752 @@
         </w:rPr>
         <w:t xml:space="preserve">Temporal coherence length L⁣ = λ²/Δλ can reach hundreds of metres in single-frequency lasers, enabling long-path interferometry. Spatial coherence allows diffraction-limited focusing to spot sizes of order λ. The beam quality factor M² compares a real beam to an ideal Gaussian; M² = 1 is the diffraction limit, and industrial fiber lasers routinely achieve M² &lt; 1.5 (Paschotta, 2008). Gain saturation sets the steady-state intracavity power, while homogeneous and inhomogeneous linewidth broadening mechanisms determine the spectral width and tuning range of the output.</w:t>
       </w:r>
+      <w:r>
+        <w:t xml:space="preserve"> Key beam and system parameters are summarised in Table 1.</w:t>
+      </w:r>
+    </w:p>
+    <w:p>
+      <w:pPr>
+        <w:spacing w:before="0" w:after="80"/>
+      </w:pPr>
+    </w:p>
+    <w:tbl>
+      <w:tblPr>
+        <w:tblW w:type="auto" w:w="0"/>
+        <w:tblLook w:firstColumn="1" w:firstRow="1" w:lastColumn="0" w:lastRow="0" w:noHBand="0" w:noVBand="1" w:val="04A0"/>
+      </w:tblPr>
+      <w:tblGrid>
+        <w:gridCol w:w="2340"/>
+        <w:gridCol w:w="2340"/>
+        <w:gridCol w:w="2340"/>
+        <w:gridCol w:w="2340"/>
+      </w:tblGrid>
+      <w:tr>
+        <w:tc>
+          <w:tcPr>
+            <w:tcW w:type="dxa" w:w="2340"/>
+            <w:shd w:val="clear" w:color="auto" w:fill="BDD7EE"/>
+            <w:tcBorders>
+              <w:top w:val="single" w:sz="4" w:space="0" w:color="888888"/>
+              <w:bottom w:val="single" w:sz="4" w:space="0" w:color="888888"/>
+              <w:left w:val="single" w:sz="4" w:space="0" w:color="888888"/>
+              <w:right w:val="single" w:sz="4" w:space="0" w:color="888888"/>
+              <w:insideH w:val="single" w:sz="4" w:space="0" w:color="888888"/>
+              <w:insideV w:val="single" w:sz="4" w:space="0" w:color="888888"/>
+            </w:tcBorders>
+          </w:tcPr>
+          <w:p>
+            <w:r>
+              <w:rPr>
+                <w:b/>
+                <w:sz w:val="16"/>
+              </w:rPr>
+              <w:t>Parameter</w:t>
+            </w:r>
+          </w:p>
+        </w:tc>
+        <w:tc>
+          <w:tcPr>
+            <w:tcW w:type="dxa" w:w="2340"/>
+            <w:shd w:val="clear" w:color="auto" w:fill="BDD7EE"/>
+            <w:tcBorders>
+              <w:top w:val="single" w:sz="4" w:space="0" w:color="888888"/>
+              <w:bottom w:val="single" w:sz="4" w:space="0" w:color="888888"/>
+              <w:left w:val="single" w:sz="4" w:space="0" w:color="888888"/>
+              <w:right w:val="single" w:sz="4" w:space="0" w:color="888888"/>
+              <w:insideH w:val="single" w:sz="4" w:space="0" w:color="888888"/>
+              <w:insideV w:val="single" w:sz="4" w:space="0" w:color="888888"/>
+            </w:tcBorders>
+          </w:tcPr>
+          <w:p>
+            <w:r>
+              <w:rPr>
+                <w:b/>
+                <w:sz w:val="16"/>
+              </w:rPr>
+              <w:t>Symbol / Unit</w:t>
+            </w:r>
+          </w:p>
+        </w:tc>
+        <w:tc>
+          <w:tcPr>
+            <w:tcW w:type="dxa" w:w="2340"/>
+            <w:shd w:val="clear" w:color="auto" w:fill="BDD7EE"/>
+            <w:tcBorders>
+              <w:top w:val="single" w:sz="4" w:space="0" w:color="888888"/>
+              <w:bottom w:val="single" w:sz="4" w:space="0" w:color="888888"/>
+              <w:left w:val="single" w:sz="4" w:space="0" w:color="888888"/>
+              <w:right w:val="single" w:sz="4" w:space="0" w:color="888888"/>
+              <w:insideH w:val="single" w:sz="4" w:space="0" w:color="888888"/>
+              <w:insideV w:val="single" w:sz="4" w:space="0" w:color="888888"/>
+            </w:tcBorders>
+          </w:tcPr>
+          <w:p>
+            <w:r>
+              <w:rPr>
+                <w:b/>
+                <w:sz w:val="16"/>
+              </w:rPr>
+              <w:t>Typical Range</w:t>
+            </w:r>
+          </w:p>
+        </w:tc>
+        <w:tc>
+          <w:tcPr>
+            <w:tcW w:type="dxa" w:w="2340"/>
+            <w:shd w:val="clear" w:color="auto" w:fill="BDD7EE"/>
+            <w:tcBorders>
+              <w:top w:val="single" w:sz="4" w:space="0" w:color="888888"/>
+              <w:bottom w:val="single" w:sz="4" w:space="0" w:color="888888"/>
+              <w:left w:val="single" w:sz="4" w:space="0" w:color="888888"/>
+              <w:right w:val="single" w:sz="4" w:space="0" w:color="888888"/>
+              <w:insideH w:val="single" w:sz="4" w:space="0" w:color="888888"/>
+              <w:insideV w:val="single" w:sz="4" w:space="0" w:color="888888"/>
+            </w:tcBorders>
+          </w:tcPr>
+          <w:p>
+            <w:r>
+              <w:rPr>
+                <w:b/>
+                <w:sz w:val="16"/>
+              </w:rPr>
+              <w:t>Practical Significance</w:t>
+            </w:r>
+          </w:p>
+        </w:tc>
+      </w:tr>
+      <w:tr>
+        <w:tc>
+          <w:tcPr>
+            <w:tcW w:type="dxa" w:w="2340"/>
+            <w:tcBorders>
+              <w:top w:val="single" w:sz="4" w:space="0" w:color="888888"/>
+              <w:bottom w:val="single" w:sz="4" w:space="0" w:color="888888"/>
+              <w:left w:val="single" w:sz="4" w:space="0" w:color="888888"/>
+              <w:right w:val="single" w:sz="4" w:space="0" w:color="888888"/>
+              <w:insideH w:val="single" w:sz="4" w:space="0" w:color="888888"/>
+              <w:insideV w:val="single" w:sz="4" w:space="0" w:color="888888"/>
+            </w:tcBorders>
+          </w:tcPr>
+          <w:p>
+            <w:r>
+              <w:rPr>
+                <w:sz w:val="16"/>
+              </w:rPr>
+              <w:t>Wavelength</w:t>
+            </w:r>
+          </w:p>
+        </w:tc>
+        <w:tc>
+          <w:tcPr>
+            <w:tcW w:type="dxa" w:w="2340"/>
+            <w:tcBorders>
+              <w:top w:val="single" w:sz="4" w:space="0" w:color="888888"/>
+              <w:bottom w:val="single" w:sz="4" w:space="0" w:color="888888"/>
+              <w:left w:val="single" w:sz="4" w:space="0" w:color="888888"/>
+              <w:right w:val="single" w:sz="4" w:space="0" w:color="888888"/>
+              <w:insideH w:val="single" w:sz="4" w:space="0" w:color="888888"/>
+              <w:insideV w:val="single" w:sz="4" w:space="0" w:color="888888"/>
+            </w:tcBorders>
+          </w:tcPr>
+          <w:p>
+            <w:r>
+              <w:rPr>
+                <w:sz w:val="16"/>
+              </w:rPr>
+              <w:t>λ / nm</w:t>
+            </w:r>
+          </w:p>
+        </w:tc>
+        <w:tc>
+          <w:tcPr>
+            <w:tcW w:type="dxa" w:w="2340"/>
+            <w:tcBorders>
+              <w:top w:val="single" w:sz="4" w:space="0" w:color="888888"/>
+              <w:bottom w:val="single" w:sz="4" w:space="0" w:color="888888"/>
+              <w:left w:val="single" w:sz="4" w:space="0" w:color="888888"/>
+              <w:right w:val="single" w:sz="4" w:space="0" w:color="888888"/>
+              <w:insideH w:val="single" w:sz="4" w:space="0" w:color="888888"/>
+              <w:insideV w:val="single" w:sz="4" w:space="0" w:color="888888"/>
+            </w:tcBorders>
+          </w:tcPr>
+          <w:p>
+            <w:r>
+              <w:rPr>
+                <w:sz w:val="16"/>
+              </w:rPr>
+              <w:t>193 nm – 10.6 µm</w:t>
+            </w:r>
+          </w:p>
+        </w:tc>
+        <w:tc>
+          <w:tcPr>
+            <w:tcW w:type="dxa" w:w="2340"/>
+            <w:tcBorders>
+              <w:top w:val="single" w:sz="4" w:space="0" w:color="888888"/>
+              <w:bottom w:val="single" w:sz="4" w:space="0" w:color="888888"/>
+              <w:left w:val="single" w:sz="4" w:space="0" w:color="888888"/>
+              <w:right w:val="single" w:sz="4" w:space="0" w:color="888888"/>
+              <w:insideH w:val="single" w:sz="4" w:space="0" w:color="888888"/>
+              <w:insideV w:val="single" w:sz="4" w:space="0" w:color="888888"/>
+            </w:tcBorders>
+          </w:tcPr>
+          <w:p>
+            <w:r>
+              <w:rPr>
+                <w:sz w:val="16"/>
+              </w:rPr>
+              <w:t>Absorption, scattering, eye hazard</w:t>
+            </w:r>
+          </w:p>
+        </w:tc>
+      </w:tr>
+      <w:tr>
+        <w:tc>
+          <w:tcPr>
+            <w:tcW w:type="dxa" w:w="2340"/>
+            <w:tcBorders>
+              <w:top w:val="single" w:sz="4" w:space="0" w:color="888888"/>
+              <w:bottom w:val="single" w:sz="4" w:space="0" w:color="888888"/>
+              <w:left w:val="single" w:sz="4" w:space="0" w:color="888888"/>
+              <w:right w:val="single" w:sz="4" w:space="0" w:color="888888"/>
+              <w:insideH w:val="single" w:sz="4" w:space="0" w:color="888888"/>
+              <w:insideV w:val="single" w:sz="4" w:space="0" w:color="888888"/>
+            </w:tcBorders>
+            <w:shd w:val="clear" w:color="auto" w:fill="F2F7FD"/>
+          </w:tcPr>
+          <w:p>
+            <w:r>
+              <w:rPr>
+                <w:sz w:val="16"/>
+              </w:rPr>
+              <w:t>Output Power</w:t>
+            </w:r>
+          </w:p>
+        </w:tc>
+        <w:tc>
+          <w:tcPr>
+            <w:tcW w:type="dxa" w:w="2340"/>
+            <w:tcBorders>
+              <w:top w:val="single" w:sz="4" w:space="0" w:color="888888"/>
+              <w:bottom w:val="single" w:sz="4" w:space="0" w:color="888888"/>
+              <w:left w:val="single" w:sz="4" w:space="0" w:color="888888"/>
+              <w:right w:val="single" w:sz="4" w:space="0" w:color="888888"/>
+              <w:insideH w:val="single" w:sz="4" w:space="0" w:color="888888"/>
+              <w:insideV w:val="single" w:sz="4" w:space="0" w:color="888888"/>
+            </w:tcBorders>
+            <w:shd w:val="clear" w:color="auto" w:fill="F2F7FD"/>
+          </w:tcPr>
+          <w:p>
+            <w:r>
+              <w:rPr>
+                <w:sz w:val="16"/>
+              </w:rPr>
+              <w:t>P / W or kW</w:t>
+            </w:r>
+          </w:p>
+        </w:tc>
+        <w:tc>
+          <w:tcPr>
+            <w:tcW w:type="dxa" w:w="2340"/>
+            <w:tcBorders>
+              <w:top w:val="single" w:sz="4" w:space="0" w:color="888888"/>
+              <w:bottom w:val="single" w:sz="4" w:space="0" w:color="888888"/>
+              <w:left w:val="single" w:sz="4" w:space="0" w:color="888888"/>
+              <w:right w:val="single" w:sz="4" w:space="0" w:color="888888"/>
+              <w:insideH w:val="single" w:sz="4" w:space="0" w:color="888888"/>
+              <w:insideV w:val="single" w:sz="4" w:space="0" w:color="888888"/>
+            </w:tcBorders>
+            <w:shd w:val="clear" w:color="auto" w:fill="F2F7FD"/>
+          </w:tcPr>
+          <w:p>
+            <w:r>
+              <w:rPr>
+                <w:sz w:val="16"/>
+              </w:rPr>
+              <w:t>mW – 100 kW</w:t>
+            </w:r>
+          </w:p>
+        </w:tc>
+        <w:tc>
+          <w:tcPr>
+            <w:tcW w:type="dxa" w:w="2340"/>
+            <w:tcBorders>
+              <w:top w:val="single" w:sz="4" w:space="0" w:color="888888"/>
+              <w:bottom w:val="single" w:sz="4" w:space="0" w:color="888888"/>
+              <w:left w:val="single" w:sz="4" w:space="0" w:color="888888"/>
+              <w:right w:val="single" w:sz="4" w:space="0" w:color="888888"/>
+              <w:insideH w:val="single" w:sz="4" w:space="0" w:color="888888"/>
+              <w:insideV w:val="single" w:sz="4" w:space="0" w:color="888888"/>
+            </w:tcBorders>
+            <w:shd w:val="clear" w:color="auto" w:fill="F2F7FD"/>
+          </w:tcPr>
+          <w:p>
+            <w:r>
+              <w:rPr>
+                <w:sz w:val="16"/>
+              </w:rPr>
+              <w:t>Drives processing speed and reach</w:t>
+            </w:r>
+          </w:p>
+        </w:tc>
+      </w:tr>
+      <w:tr>
+        <w:tc>
+          <w:tcPr>
+            <w:tcW w:type="dxa" w:w="2340"/>
+            <w:tcBorders>
+              <w:top w:val="single" w:sz="4" w:space="0" w:color="888888"/>
+              <w:bottom w:val="single" w:sz="4" w:space="0" w:color="888888"/>
+              <w:left w:val="single" w:sz="4" w:space="0" w:color="888888"/>
+              <w:right w:val="single" w:sz="4" w:space="0" w:color="888888"/>
+              <w:insideH w:val="single" w:sz="4" w:space="0" w:color="888888"/>
+              <w:insideV w:val="single" w:sz="4" w:space="0" w:color="888888"/>
+            </w:tcBorders>
+          </w:tcPr>
+          <w:p>
+            <w:r>
+              <w:rPr>
+                <w:sz w:val="16"/>
+              </w:rPr>
+              <w:t>Pulse Duration</w:t>
+            </w:r>
+          </w:p>
+        </w:tc>
+        <w:tc>
+          <w:tcPr>
+            <w:tcW w:type="dxa" w:w="2340"/>
+            <w:tcBorders>
+              <w:top w:val="single" w:sz="4" w:space="0" w:color="888888"/>
+              <w:bottom w:val="single" w:sz="4" w:space="0" w:color="888888"/>
+              <w:left w:val="single" w:sz="4" w:space="0" w:color="888888"/>
+              <w:right w:val="single" w:sz="4" w:space="0" w:color="888888"/>
+              <w:insideH w:val="single" w:sz="4" w:space="0" w:color="888888"/>
+              <w:insideV w:val="single" w:sz="4" w:space="0" w:color="888888"/>
+            </w:tcBorders>
+          </w:tcPr>
+          <w:p>
+            <w:r>
+              <w:rPr>
+                <w:sz w:val="16"/>
+              </w:rPr>
+              <w:t>τp / s</w:t>
+            </w:r>
+          </w:p>
+        </w:tc>
+        <w:tc>
+          <w:tcPr>
+            <w:tcW w:type="dxa" w:w="2340"/>
+            <w:tcBorders>
+              <w:top w:val="single" w:sz="4" w:space="0" w:color="888888"/>
+              <w:bottom w:val="single" w:sz="4" w:space="0" w:color="888888"/>
+              <w:left w:val="single" w:sz="4" w:space="0" w:color="888888"/>
+              <w:right w:val="single" w:sz="4" w:space="0" w:color="888888"/>
+              <w:insideH w:val="single" w:sz="4" w:space="0" w:color="888888"/>
+              <w:insideV w:val="single" w:sz="4" w:space="0" w:color="888888"/>
+            </w:tcBorders>
+          </w:tcPr>
+          <w:p>
+            <w:r>
+              <w:rPr>
+                <w:sz w:val="16"/>
+              </w:rPr>
+              <w:t>CW to &lt; 1 as</w:t>
+            </w:r>
+          </w:p>
+        </w:tc>
+        <w:tc>
+          <w:tcPr>
+            <w:tcW w:type="dxa" w:w="2340"/>
+            <w:tcBorders>
+              <w:top w:val="single" w:sz="4" w:space="0" w:color="888888"/>
+              <w:bottom w:val="single" w:sz="4" w:space="0" w:color="888888"/>
+              <w:left w:val="single" w:sz="4" w:space="0" w:color="888888"/>
+              <w:right w:val="single" w:sz="4" w:space="0" w:color="888888"/>
+              <w:insideH w:val="single" w:sz="4" w:space="0" w:color="888888"/>
+              <w:insideV w:val="single" w:sz="4" w:space="0" w:color="888888"/>
+            </w:tcBorders>
+          </w:tcPr>
+          <w:p>
+            <w:r>
+              <w:rPr>
+                <w:sz w:val="16"/>
+              </w:rPr>
+              <w:t>Controls HAZ and peak power</w:t>
+            </w:r>
+          </w:p>
+        </w:tc>
+      </w:tr>
+      <w:tr>
+        <w:tc>
+          <w:tcPr>
+            <w:tcW w:type="dxa" w:w="2340"/>
+            <w:tcBorders>
+              <w:top w:val="single" w:sz="4" w:space="0" w:color="888888"/>
+              <w:bottom w:val="single" w:sz="4" w:space="0" w:color="888888"/>
+              <w:left w:val="single" w:sz="4" w:space="0" w:color="888888"/>
+              <w:right w:val="single" w:sz="4" w:space="0" w:color="888888"/>
+              <w:insideH w:val="single" w:sz="4" w:space="0" w:color="888888"/>
+              <w:insideV w:val="single" w:sz="4" w:space="0" w:color="888888"/>
+            </w:tcBorders>
+            <w:shd w:val="clear" w:color="auto" w:fill="F2F7FD"/>
+          </w:tcPr>
+          <w:p>
+            <w:r>
+              <w:rPr>
+                <w:sz w:val="16"/>
+              </w:rPr>
+              <w:t>Beam Quality</w:t>
+            </w:r>
+          </w:p>
+        </w:tc>
+        <w:tc>
+          <w:tcPr>
+            <w:tcW w:type="dxa" w:w="2340"/>
+            <w:tcBorders>
+              <w:top w:val="single" w:sz="4" w:space="0" w:color="888888"/>
+              <w:bottom w:val="single" w:sz="4" w:space="0" w:color="888888"/>
+              <w:left w:val="single" w:sz="4" w:space="0" w:color="888888"/>
+              <w:right w:val="single" w:sz="4" w:space="0" w:color="888888"/>
+              <w:insideH w:val="single" w:sz="4" w:space="0" w:color="888888"/>
+              <w:insideV w:val="single" w:sz="4" w:space="0" w:color="888888"/>
+            </w:tcBorders>
+            <w:shd w:val="clear" w:color="auto" w:fill="F2F7FD"/>
+          </w:tcPr>
+          <w:p>
+            <w:r>
+              <w:rPr>
+                <w:sz w:val="16"/>
+              </w:rPr>
+              <w:t>M²</w:t>
+            </w:r>
+          </w:p>
+        </w:tc>
+        <w:tc>
+          <w:tcPr>
+            <w:tcW w:type="dxa" w:w="2340"/>
+            <w:tcBorders>
+              <w:top w:val="single" w:sz="4" w:space="0" w:color="888888"/>
+              <w:bottom w:val="single" w:sz="4" w:space="0" w:color="888888"/>
+              <w:left w:val="single" w:sz="4" w:space="0" w:color="888888"/>
+              <w:right w:val="single" w:sz="4" w:space="0" w:color="888888"/>
+              <w:insideH w:val="single" w:sz="4" w:space="0" w:color="888888"/>
+              <w:insideV w:val="single" w:sz="4" w:space="0" w:color="888888"/>
+            </w:tcBorders>
+            <w:shd w:val="clear" w:color="auto" w:fill="F2F7FD"/>
+          </w:tcPr>
+          <w:p>
+            <w:r>
+              <w:rPr>
+                <w:sz w:val="16"/>
+              </w:rPr>
+              <w:t>1.0 – ~5</w:t>
+            </w:r>
+          </w:p>
+        </w:tc>
+        <w:tc>
+          <w:tcPr>
+            <w:tcW w:type="dxa" w:w="2340"/>
+            <w:tcBorders>
+              <w:top w:val="single" w:sz="4" w:space="0" w:color="888888"/>
+              <w:bottom w:val="single" w:sz="4" w:space="0" w:color="888888"/>
+              <w:left w:val="single" w:sz="4" w:space="0" w:color="888888"/>
+              <w:right w:val="single" w:sz="4" w:space="0" w:color="888888"/>
+              <w:insideH w:val="single" w:sz="4" w:space="0" w:color="888888"/>
+              <w:insideV w:val="single" w:sz="4" w:space="0" w:color="888888"/>
+            </w:tcBorders>
+            <w:shd w:val="clear" w:color="auto" w:fill="F2F7FD"/>
+          </w:tcPr>
+          <w:p>
+            <w:r>
+              <w:rPr>
+                <w:sz w:val="16"/>
+              </w:rPr>
+              <w:t>Focusability and fibre-coupling</w:t>
+            </w:r>
+          </w:p>
+        </w:tc>
+      </w:tr>
+      <w:tr>
+        <w:tc>
+          <w:tcPr>
+            <w:tcW w:type="dxa" w:w="2340"/>
+            <w:tcBorders>
+              <w:top w:val="single" w:sz="4" w:space="0" w:color="888888"/>
+              <w:bottom w:val="single" w:sz="4" w:space="0" w:color="888888"/>
+              <w:left w:val="single" w:sz="4" w:space="0" w:color="888888"/>
+              <w:right w:val="single" w:sz="4" w:space="0" w:color="888888"/>
+              <w:insideH w:val="single" w:sz="4" w:space="0" w:color="888888"/>
+              <w:insideV w:val="single" w:sz="4" w:space="0" w:color="888888"/>
+            </w:tcBorders>
+          </w:tcPr>
+          <w:p>
+            <w:r>
+              <w:rPr>
+                <w:sz w:val="16"/>
+              </w:rPr>
+              <w:t>Coherence Length</w:t>
+            </w:r>
+          </w:p>
+        </w:tc>
+        <w:tc>
+          <w:tcPr>
+            <w:tcW w:type="dxa" w:w="2340"/>
+            <w:tcBorders>
+              <w:top w:val="single" w:sz="4" w:space="0" w:color="888888"/>
+              <w:bottom w:val="single" w:sz="4" w:space="0" w:color="888888"/>
+              <w:left w:val="single" w:sz="4" w:space="0" w:color="888888"/>
+              <w:right w:val="single" w:sz="4" w:space="0" w:color="888888"/>
+              <w:insideH w:val="single" w:sz="4" w:space="0" w:color="888888"/>
+              <w:insideV w:val="single" w:sz="4" w:space="0" w:color="888888"/>
+            </w:tcBorders>
+          </w:tcPr>
+          <w:p>
+            <w:r>
+              <w:rPr>
+                <w:sz w:val="16"/>
+              </w:rPr>
+              <w:t>Lc / m</w:t>
+            </w:r>
+          </w:p>
+        </w:tc>
+        <w:tc>
+          <w:tcPr>
+            <w:tcW w:type="dxa" w:w="2340"/>
+            <w:tcBorders>
+              <w:top w:val="single" w:sz="4" w:space="0" w:color="888888"/>
+              <w:bottom w:val="single" w:sz="4" w:space="0" w:color="888888"/>
+              <w:left w:val="single" w:sz="4" w:space="0" w:color="888888"/>
+              <w:right w:val="single" w:sz="4" w:space="0" w:color="888888"/>
+              <w:insideH w:val="single" w:sz="4" w:space="0" w:color="888888"/>
+              <w:insideV w:val="single" w:sz="4" w:space="0" w:color="888888"/>
+            </w:tcBorders>
+          </w:tcPr>
+          <w:p>
+            <w:r>
+              <w:rPr>
+                <w:sz w:val="16"/>
+              </w:rPr>
+              <w:t>mm – km</w:t>
+            </w:r>
+          </w:p>
+        </w:tc>
+        <w:tc>
+          <w:tcPr>
+            <w:tcW w:type="dxa" w:w="2340"/>
+            <w:tcBorders>
+              <w:top w:val="single" w:sz="4" w:space="0" w:color="888888"/>
+              <w:bottom w:val="single" w:sz="4" w:space="0" w:color="888888"/>
+              <w:left w:val="single" w:sz="4" w:space="0" w:color="888888"/>
+              <w:right w:val="single" w:sz="4" w:space="0" w:color="888888"/>
+              <w:insideH w:val="single" w:sz="4" w:space="0" w:color="888888"/>
+              <w:insideV w:val="single" w:sz="4" w:space="0" w:color="888888"/>
+            </w:tcBorders>
+          </w:tcPr>
+          <w:p>
+            <w:r>
+              <w:rPr>
+                <w:sz w:val="16"/>
+              </w:rPr>
+              <w:t>Holography, interferometry, telecom</w:t>
+            </w:r>
+          </w:p>
+        </w:tc>
+      </w:tr>
+      <w:tr>
+        <w:tc>
+          <w:tcPr>
+            <w:tcW w:type="dxa" w:w="2340"/>
+            <w:tcBorders>
+              <w:top w:val="single" w:sz="4" w:space="0" w:color="888888"/>
+              <w:bottom w:val="single" w:sz="4" w:space="0" w:color="888888"/>
+              <w:left w:val="single" w:sz="4" w:space="0" w:color="888888"/>
+              <w:right w:val="single" w:sz="4" w:space="0" w:color="888888"/>
+              <w:insideH w:val="single" w:sz="4" w:space="0" w:color="888888"/>
+              <w:insideV w:val="single" w:sz="4" w:space="0" w:color="888888"/>
+            </w:tcBorders>
+            <w:shd w:val="clear" w:color="auto" w:fill="F2F7FD"/>
+          </w:tcPr>
+          <w:p>
+            <w:r>
+              <w:rPr>
+                <w:sz w:val="16"/>
+              </w:rPr>
+              <w:t>Repetition Rate</w:t>
+            </w:r>
+          </w:p>
+        </w:tc>
+        <w:tc>
+          <w:tcPr>
+            <w:tcW w:type="dxa" w:w="2340"/>
+            <w:tcBorders>
+              <w:top w:val="single" w:sz="4" w:space="0" w:color="888888"/>
+              <w:bottom w:val="single" w:sz="4" w:space="0" w:color="888888"/>
+              <w:left w:val="single" w:sz="4" w:space="0" w:color="888888"/>
+              <w:right w:val="single" w:sz="4" w:space="0" w:color="888888"/>
+              <w:insideH w:val="single" w:sz="4" w:space="0" w:color="888888"/>
+              <w:insideV w:val="single" w:sz="4" w:space="0" w:color="888888"/>
+            </w:tcBorders>
+            <w:shd w:val="clear" w:color="auto" w:fill="F2F7FD"/>
+          </w:tcPr>
+          <w:p>
+            <w:r>
+              <w:rPr>
+                <w:sz w:val="16"/>
+              </w:rPr>
+              <w:t>frep / Hz</w:t>
+            </w:r>
+          </w:p>
+        </w:tc>
+        <w:tc>
+          <w:tcPr>
+            <w:tcW w:type="dxa" w:w="2340"/>
+            <w:tcBorders>
+              <w:top w:val="single" w:sz="4" w:space="0" w:color="888888"/>
+              <w:bottom w:val="single" w:sz="4" w:space="0" w:color="888888"/>
+              <w:left w:val="single" w:sz="4" w:space="0" w:color="888888"/>
+              <w:right w:val="single" w:sz="4" w:space="0" w:color="888888"/>
+              <w:insideH w:val="single" w:sz="4" w:space="0" w:color="888888"/>
+              <w:insideV w:val="single" w:sz="4" w:space="0" w:color="888888"/>
+            </w:tcBorders>
+            <w:shd w:val="clear" w:color="auto" w:fill="F2F7FD"/>
+          </w:tcPr>
+          <w:p>
+            <w:r>
+              <w:rPr>
+                <w:sz w:val="16"/>
+              </w:rPr>
+              <w:t>Single-shot – GHz</w:t>
+            </w:r>
+          </w:p>
+        </w:tc>
+        <w:tc>
+          <w:tcPr>
+            <w:tcW w:type="dxa" w:w="2340"/>
+            <w:tcBorders>
+              <w:top w:val="single" w:sz="4" w:space="0" w:color="888888"/>
+              <w:bottom w:val="single" w:sz="4" w:space="0" w:color="888888"/>
+              <w:left w:val="single" w:sz="4" w:space="0" w:color="888888"/>
+              <w:right w:val="single" w:sz="4" w:space="0" w:color="888888"/>
+              <w:insideH w:val="single" w:sz="4" w:space="0" w:color="888888"/>
+              <w:insideV w:val="single" w:sz="4" w:space="0" w:color="888888"/>
+            </w:tcBorders>
+            <w:shd w:val="clear" w:color="auto" w:fill="F2F7FD"/>
+          </w:tcPr>
+          <w:p>
+            <w:r>
+              <w:rPr>
+                <w:sz w:val="16"/>
+              </w:rPr>
+              <w:t>Throughput in pulsed processing</w:t>
+            </w:r>
+          </w:p>
+        </w:tc>
+      </w:tr>
+      <w:tr>
+        <w:tc>
+          <w:tcPr>
+            <w:tcW w:type="dxa" w:w="2340"/>
+            <w:tcBorders>
+              <w:top w:val="single" w:sz="4" w:space="0" w:color="888888"/>
+              <w:bottom w:val="single" w:sz="4" w:space="0" w:color="888888"/>
+              <w:left w:val="single" w:sz="4" w:space="0" w:color="888888"/>
+              <w:right w:val="single" w:sz="4" w:space="0" w:color="888888"/>
+              <w:insideH w:val="single" w:sz="4" w:space="0" w:color="888888"/>
+              <w:insideV w:val="single" w:sz="4" w:space="0" w:color="888888"/>
+            </w:tcBorders>
+          </w:tcPr>
+          <w:p>
+            <w:r>
+              <w:rPr>
+                <w:sz w:val="16"/>
+              </w:rPr>
+              <w:t>Wall-plug Eff.</w:t>
+            </w:r>
+          </w:p>
+        </w:tc>
+        <w:tc>
+          <w:tcPr>
+            <w:tcW w:type="dxa" w:w="2340"/>
+            <w:tcBorders>
+              <w:top w:val="single" w:sz="4" w:space="0" w:color="888888"/>
+              <w:bottom w:val="single" w:sz="4" w:space="0" w:color="888888"/>
+              <w:left w:val="single" w:sz="4" w:space="0" w:color="888888"/>
+              <w:right w:val="single" w:sz="4" w:space="0" w:color="888888"/>
+              <w:insideH w:val="single" w:sz="4" w:space="0" w:color="888888"/>
+              <w:insideV w:val="single" w:sz="4" w:space="0" w:color="888888"/>
+            </w:tcBorders>
+          </w:tcPr>
+          <w:p>
+            <w:r>
+              <w:rPr>
+                <w:sz w:val="16"/>
+              </w:rPr>
+              <w:t>η / %</w:t>
+            </w:r>
+          </w:p>
+        </w:tc>
+        <w:tc>
+          <w:tcPr>
+            <w:tcW w:type="dxa" w:w="2340"/>
+            <w:tcBorders>
+              <w:top w:val="single" w:sz="4" w:space="0" w:color="888888"/>
+              <w:bottom w:val="single" w:sz="4" w:space="0" w:color="888888"/>
+              <w:left w:val="single" w:sz="4" w:space="0" w:color="888888"/>
+              <w:right w:val="single" w:sz="4" w:space="0" w:color="888888"/>
+              <w:insideH w:val="single" w:sz="4" w:space="0" w:color="888888"/>
+              <w:insideV w:val="single" w:sz="4" w:space="0" w:color="888888"/>
+            </w:tcBorders>
+          </w:tcPr>
+          <w:p>
+            <w:r>
+              <w:rPr>
+                <w:sz w:val="16"/>
+              </w:rPr>
+              <w:t>1 – ~75 (diodes)</w:t>
+            </w:r>
+          </w:p>
+        </w:tc>
+        <w:tc>
+          <w:tcPr>
+            <w:tcW w:type="dxa" w:w="2340"/>
+            <w:tcBorders>
+              <w:top w:val="single" w:sz="4" w:space="0" w:color="888888"/>
+              <w:bottom w:val="single" w:sz="4" w:space="0" w:color="888888"/>
+              <w:left w:val="single" w:sz="4" w:space="0" w:color="888888"/>
+              <w:right w:val="single" w:sz="4" w:space="0" w:color="888888"/>
+              <w:insideH w:val="single" w:sz="4" w:space="0" w:color="888888"/>
+              <w:insideV w:val="single" w:sz="4" w:space="0" w:color="888888"/>
+            </w:tcBorders>
+          </w:tcPr>
+          <w:p>
+            <w:r>
+              <w:rPr>
+                <w:sz w:val="16"/>
+              </w:rPr>
+              <w:t>Operating cost, thermal management</w:t>
+            </w:r>
+          </w:p>
+        </w:tc>
+      </w:tr>
+    </w:tbl>
+    <w:p>
+      <w:pPr>
+        <w:jc w:val="center"/>
+      </w:pPr>
+      <w:r>
+        <w:rPr>
+          <w:i/>
+          <w:color w:val="444444"/>
+          <w:sz w:val="17"/>
+        </w:rPr>
+        <w:t>Table 1: Key laser performance parameters and their practical significance.</w:t>
+      </w:r>
+    </w:p>
+    <w:p>
+      <w:pPr>
+        <w:spacing w:before="0" w:after="80"/>
+      </w:pPr>
     </w:p>
     <w:p>
       <w:r>
@@ -749,6 +1690,928 @@
         </w:rPr>
         <w:t xml:space="preserve">Liquid dye lasers offer continuous tunability across 50–100 nm per dye, covering the entire visible spectrum. They have been largely superseded by Ti:sapphire and tunable diode sources for most applications. Free-electron lasers (FELs) operate on an entirely different principle: a relativistic electron beam traversing a periodic undulator magnet array generates coherent radiation tunable from the terahertz to the hard X-ray regime. The European XFEL produces femtosecond X-ray pulses that are transforming structural biology by enabling single-particle diffractive imaging of proteins that resist crystallisation (Bass et al., 2010).</w:t>
       </w:r>
+      <w:r>
+        <w:t xml:space="preserve"> A comparative overview of the principal laser families is provided in Table 2.</w:t>
+      </w:r>
+    </w:p>
+    <w:p>
+      <w:pPr>
+        <w:spacing w:before="0" w:after="80"/>
+      </w:pPr>
+    </w:p>
+    <w:tbl>
+      <w:tblPr>
+        <w:tblW w:type="auto" w:w="0"/>
+        <w:tblLook w:firstColumn="1" w:firstRow="1" w:lastColumn="0" w:lastRow="0" w:noHBand="0" w:noVBand="1" w:val="04A0"/>
+      </w:tblPr>
+      <w:tblGrid>
+        <w:gridCol w:w="2340"/>
+        <w:gridCol w:w="2340"/>
+        <w:gridCol w:w="2340"/>
+        <w:gridCol w:w="2340"/>
+      </w:tblGrid>
+      <w:tr>
+        <w:tc>
+          <w:tcPr>
+            <w:tcW w:type="dxa" w:w="2340"/>
+            <w:shd w:val="clear" w:color="auto" w:fill="BDD7EE"/>
+            <w:tcBorders>
+              <w:top w:val="single" w:sz="4" w:space="0" w:color="888888"/>
+              <w:bottom w:val="single" w:sz="4" w:space="0" w:color="888888"/>
+              <w:left w:val="single" w:sz="4" w:space="0" w:color="888888"/>
+              <w:right w:val="single" w:sz="4" w:space="0" w:color="888888"/>
+              <w:insideH w:val="single" w:sz="4" w:space="0" w:color="888888"/>
+              <w:insideV w:val="single" w:sz="4" w:space="0" w:color="888888"/>
+            </w:tcBorders>
+          </w:tcPr>
+          <w:p>
+            <w:r>
+              <w:rPr>
+                <w:b/>
+                <w:sz w:val="16"/>
+              </w:rPr>
+              <w:t>Laser Type</w:t>
+            </w:r>
+          </w:p>
+        </w:tc>
+        <w:tc>
+          <w:tcPr>
+            <w:tcW w:type="dxa" w:w="2340"/>
+            <w:shd w:val="clear" w:color="auto" w:fill="BDD7EE"/>
+            <w:tcBorders>
+              <w:top w:val="single" w:sz="4" w:space="0" w:color="888888"/>
+              <w:bottom w:val="single" w:sz="4" w:space="0" w:color="888888"/>
+              <w:left w:val="single" w:sz="4" w:space="0" w:color="888888"/>
+              <w:right w:val="single" w:sz="4" w:space="0" w:color="888888"/>
+              <w:insideH w:val="single" w:sz="4" w:space="0" w:color="888888"/>
+              <w:insideV w:val="single" w:sz="4" w:space="0" w:color="888888"/>
+            </w:tcBorders>
+          </w:tcPr>
+          <w:p>
+            <w:r>
+              <w:rPr>
+                <w:b/>
+                <w:sz w:val="16"/>
+              </w:rPr>
+              <w:t>Wavelength Range</w:t>
+            </w:r>
+          </w:p>
+        </w:tc>
+        <w:tc>
+          <w:tcPr>
+            <w:tcW w:type="dxa" w:w="2340"/>
+            <w:shd w:val="clear" w:color="auto" w:fill="BDD7EE"/>
+            <w:tcBorders>
+              <w:top w:val="single" w:sz="4" w:space="0" w:color="888888"/>
+              <w:bottom w:val="single" w:sz="4" w:space="0" w:color="888888"/>
+              <w:left w:val="single" w:sz="4" w:space="0" w:color="888888"/>
+              <w:right w:val="single" w:sz="4" w:space="0" w:color="888888"/>
+              <w:insideH w:val="single" w:sz="4" w:space="0" w:color="888888"/>
+              <w:insideV w:val="single" w:sz="4" w:space="0" w:color="888888"/>
+            </w:tcBorders>
+          </w:tcPr>
+          <w:p>
+            <w:r>
+              <w:rPr>
+                <w:b/>
+                <w:sz w:val="16"/>
+              </w:rPr>
+              <w:t>Power / Energy</w:t>
+            </w:r>
+          </w:p>
+        </w:tc>
+        <w:tc>
+          <w:tcPr>
+            <w:tcW w:type="dxa" w:w="2340"/>
+            <w:shd w:val="clear" w:color="auto" w:fill="BDD7EE"/>
+            <w:tcBorders>
+              <w:top w:val="single" w:sz="4" w:space="0" w:color="888888"/>
+              <w:bottom w:val="single" w:sz="4" w:space="0" w:color="888888"/>
+              <w:left w:val="single" w:sz="4" w:space="0" w:color="888888"/>
+              <w:right w:val="single" w:sz="4" w:space="0" w:color="888888"/>
+              <w:insideH w:val="single" w:sz="4" w:space="0" w:color="888888"/>
+              <w:insideV w:val="single" w:sz="4" w:space="0" w:color="888888"/>
+            </w:tcBorders>
+          </w:tcPr>
+          <w:p>
+            <w:r>
+              <w:rPr>
+                <w:b/>
+                <w:sz w:val="16"/>
+              </w:rPr>
+              <w:t>Primary Applications</w:t>
+            </w:r>
+          </w:p>
+        </w:tc>
+      </w:tr>
+      <w:tr>
+        <w:tc>
+          <w:tcPr>
+            <w:tcW w:type="dxa" w:w="2340"/>
+            <w:tcBorders>
+              <w:top w:val="single" w:sz="4" w:space="0" w:color="888888"/>
+              <w:bottom w:val="single" w:sz="4" w:space="0" w:color="888888"/>
+              <w:left w:val="single" w:sz="4" w:space="0" w:color="888888"/>
+              <w:right w:val="single" w:sz="4" w:space="0" w:color="888888"/>
+              <w:insideH w:val="single" w:sz="4" w:space="0" w:color="888888"/>
+              <w:insideV w:val="single" w:sz="4" w:space="0" w:color="888888"/>
+            </w:tcBorders>
+          </w:tcPr>
+          <w:p>
+            <w:r>
+              <w:rPr>
+                <w:sz w:val="16"/>
+              </w:rPr>
+              <w:t>He–Ne (gas)</w:t>
+            </w:r>
+          </w:p>
+        </w:tc>
+        <w:tc>
+          <w:tcPr>
+            <w:tcW w:type="dxa" w:w="2340"/>
+            <w:tcBorders>
+              <w:top w:val="single" w:sz="4" w:space="0" w:color="888888"/>
+              <w:bottom w:val="single" w:sz="4" w:space="0" w:color="888888"/>
+              <w:left w:val="single" w:sz="4" w:space="0" w:color="888888"/>
+              <w:right w:val="single" w:sz="4" w:space="0" w:color="888888"/>
+              <w:insideH w:val="single" w:sz="4" w:space="0" w:color="888888"/>
+              <w:insideV w:val="single" w:sz="4" w:space="0" w:color="888888"/>
+            </w:tcBorders>
+          </w:tcPr>
+          <w:p>
+            <w:r>
+              <w:rPr>
+                <w:sz w:val="16"/>
+              </w:rPr>
+              <w:t>543–633 nm</w:t>
+            </w:r>
+          </w:p>
+        </w:tc>
+        <w:tc>
+          <w:tcPr>
+            <w:tcW w:type="dxa" w:w="2340"/>
+            <w:tcBorders>
+              <w:top w:val="single" w:sz="4" w:space="0" w:color="888888"/>
+              <w:bottom w:val="single" w:sz="4" w:space="0" w:color="888888"/>
+              <w:left w:val="single" w:sz="4" w:space="0" w:color="888888"/>
+              <w:right w:val="single" w:sz="4" w:space="0" w:color="888888"/>
+              <w:insideH w:val="single" w:sz="4" w:space="0" w:color="888888"/>
+              <w:insideV w:val="single" w:sz="4" w:space="0" w:color="888888"/>
+            </w:tcBorders>
+          </w:tcPr>
+          <w:p>
+            <w:r>
+              <w:rPr>
+                <w:sz w:val="16"/>
+              </w:rPr>
+              <w:t>µW – 50 mW</w:t>
+            </w:r>
+          </w:p>
+        </w:tc>
+        <w:tc>
+          <w:tcPr>
+            <w:tcW w:type="dxa" w:w="2340"/>
+            <w:tcBorders>
+              <w:top w:val="single" w:sz="4" w:space="0" w:color="888888"/>
+              <w:bottom w:val="single" w:sz="4" w:space="0" w:color="888888"/>
+              <w:left w:val="single" w:sz="4" w:space="0" w:color="888888"/>
+              <w:right w:val="single" w:sz="4" w:space="0" w:color="888888"/>
+              <w:insideH w:val="single" w:sz="4" w:space="0" w:color="888888"/>
+              <w:insideV w:val="single" w:sz="4" w:space="0" w:color="888888"/>
+            </w:tcBorders>
+          </w:tcPr>
+          <w:p>
+            <w:r>
+              <w:rPr>
+                <w:sz w:val="16"/>
+              </w:rPr>
+              <w:t>Alignment, metrology, holography</w:t>
+            </w:r>
+          </w:p>
+        </w:tc>
+      </w:tr>
+      <w:tr>
+        <w:tc>
+          <w:tcPr>
+            <w:tcW w:type="dxa" w:w="2340"/>
+            <w:tcBorders>
+              <w:top w:val="single" w:sz="4" w:space="0" w:color="888888"/>
+              <w:bottom w:val="single" w:sz="4" w:space="0" w:color="888888"/>
+              <w:left w:val="single" w:sz="4" w:space="0" w:color="888888"/>
+              <w:right w:val="single" w:sz="4" w:space="0" w:color="888888"/>
+              <w:insideH w:val="single" w:sz="4" w:space="0" w:color="888888"/>
+              <w:insideV w:val="single" w:sz="4" w:space="0" w:color="888888"/>
+            </w:tcBorders>
+            <w:shd w:val="clear" w:color="auto" w:fill="F2F7FD"/>
+          </w:tcPr>
+          <w:p>
+            <w:r>
+              <w:rPr>
+                <w:sz w:val="16"/>
+              </w:rPr>
+              <w:t>CO₂ (gas)</w:t>
+            </w:r>
+          </w:p>
+        </w:tc>
+        <w:tc>
+          <w:tcPr>
+            <w:tcW w:type="dxa" w:w="2340"/>
+            <w:tcBorders>
+              <w:top w:val="single" w:sz="4" w:space="0" w:color="888888"/>
+              <w:bottom w:val="single" w:sz="4" w:space="0" w:color="888888"/>
+              <w:left w:val="single" w:sz="4" w:space="0" w:color="888888"/>
+              <w:right w:val="single" w:sz="4" w:space="0" w:color="888888"/>
+              <w:insideH w:val="single" w:sz="4" w:space="0" w:color="888888"/>
+              <w:insideV w:val="single" w:sz="4" w:space="0" w:color="888888"/>
+            </w:tcBorders>
+            <w:shd w:val="clear" w:color="auto" w:fill="F2F7FD"/>
+          </w:tcPr>
+          <w:p>
+            <w:r>
+              <w:rPr>
+                <w:sz w:val="16"/>
+              </w:rPr>
+              <w:t>9.4, 10.6 µm</w:t>
+            </w:r>
+          </w:p>
+        </w:tc>
+        <w:tc>
+          <w:tcPr>
+            <w:tcW w:type="dxa" w:w="2340"/>
+            <w:tcBorders>
+              <w:top w:val="single" w:sz="4" w:space="0" w:color="888888"/>
+              <w:bottom w:val="single" w:sz="4" w:space="0" w:color="888888"/>
+              <w:left w:val="single" w:sz="4" w:space="0" w:color="888888"/>
+              <w:right w:val="single" w:sz="4" w:space="0" w:color="888888"/>
+              <w:insideH w:val="single" w:sz="4" w:space="0" w:color="888888"/>
+              <w:insideV w:val="single" w:sz="4" w:space="0" w:color="888888"/>
+            </w:tcBorders>
+            <w:shd w:val="clear" w:color="auto" w:fill="F2F7FD"/>
+          </w:tcPr>
+          <w:p>
+            <w:r>
+              <w:rPr>
+                <w:sz w:val="16"/>
+              </w:rPr>
+              <w:t>1 W – 100 kW</w:t>
+            </w:r>
+          </w:p>
+        </w:tc>
+        <w:tc>
+          <w:tcPr>
+            <w:tcW w:type="dxa" w:w="2340"/>
+            <w:tcBorders>
+              <w:top w:val="single" w:sz="4" w:space="0" w:color="888888"/>
+              <w:bottom w:val="single" w:sz="4" w:space="0" w:color="888888"/>
+              <w:left w:val="single" w:sz="4" w:space="0" w:color="888888"/>
+              <w:right w:val="single" w:sz="4" w:space="0" w:color="888888"/>
+              <w:insideH w:val="single" w:sz="4" w:space="0" w:color="888888"/>
+              <w:insideV w:val="single" w:sz="4" w:space="0" w:color="888888"/>
+            </w:tcBorders>
+            <w:shd w:val="clear" w:color="auto" w:fill="F2F7FD"/>
+          </w:tcPr>
+          <w:p>
+            <w:r>
+              <w:rPr>
+                <w:sz w:val="16"/>
+              </w:rPr>
+              <w:t>Cutting, welding, medical, engraving</w:t>
+            </w:r>
+          </w:p>
+        </w:tc>
+      </w:tr>
+      <w:tr>
+        <w:tc>
+          <w:tcPr>
+            <w:tcW w:type="dxa" w:w="2340"/>
+            <w:tcBorders>
+              <w:top w:val="single" w:sz="4" w:space="0" w:color="888888"/>
+              <w:bottom w:val="single" w:sz="4" w:space="0" w:color="888888"/>
+              <w:left w:val="single" w:sz="4" w:space="0" w:color="888888"/>
+              <w:right w:val="single" w:sz="4" w:space="0" w:color="888888"/>
+              <w:insideH w:val="single" w:sz="4" w:space="0" w:color="888888"/>
+              <w:insideV w:val="single" w:sz="4" w:space="0" w:color="888888"/>
+            </w:tcBorders>
+          </w:tcPr>
+          <w:p>
+            <w:r>
+              <w:rPr>
+                <w:sz w:val="16"/>
+              </w:rPr>
+              <w:t>Excimer (gas)</w:t>
+            </w:r>
+          </w:p>
+        </w:tc>
+        <w:tc>
+          <w:tcPr>
+            <w:tcW w:type="dxa" w:w="2340"/>
+            <w:tcBorders>
+              <w:top w:val="single" w:sz="4" w:space="0" w:color="888888"/>
+              <w:bottom w:val="single" w:sz="4" w:space="0" w:color="888888"/>
+              <w:left w:val="single" w:sz="4" w:space="0" w:color="888888"/>
+              <w:right w:val="single" w:sz="4" w:space="0" w:color="888888"/>
+              <w:insideH w:val="single" w:sz="4" w:space="0" w:color="888888"/>
+              <w:insideV w:val="single" w:sz="4" w:space="0" w:color="888888"/>
+            </w:tcBorders>
+          </w:tcPr>
+          <w:p>
+            <w:r>
+              <w:rPr>
+                <w:sz w:val="16"/>
+              </w:rPr>
+              <w:t>193–351 nm</w:t>
+            </w:r>
+          </w:p>
+        </w:tc>
+        <w:tc>
+          <w:tcPr>
+            <w:tcW w:type="dxa" w:w="2340"/>
+            <w:tcBorders>
+              <w:top w:val="single" w:sz="4" w:space="0" w:color="888888"/>
+              <w:bottom w:val="single" w:sz="4" w:space="0" w:color="888888"/>
+              <w:left w:val="single" w:sz="4" w:space="0" w:color="888888"/>
+              <w:right w:val="single" w:sz="4" w:space="0" w:color="888888"/>
+              <w:insideH w:val="single" w:sz="4" w:space="0" w:color="888888"/>
+              <w:insideV w:val="single" w:sz="4" w:space="0" w:color="888888"/>
+            </w:tcBorders>
+          </w:tcPr>
+          <w:p>
+            <w:r>
+              <w:rPr>
+                <w:sz w:val="16"/>
+              </w:rPr>
+              <w:t>1–200 mJ/pulse</w:t>
+            </w:r>
+          </w:p>
+        </w:tc>
+        <w:tc>
+          <w:tcPr>
+            <w:tcW w:type="dxa" w:w="2340"/>
+            <w:tcBorders>
+              <w:top w:val="single" w:sz="4" w:space="0" w:color="888888"/>
+              <w:bottom w:val="single" w:sz="4" w:space="0" w:color="888888"/>
+              <w:left w:val="single" w:sz="4" w:space="0" w:color="888888"/>
+              <w:right w:val="single" w:sz="4" w:space="0" w:color="888888"/>
+              <w:insideH w:val="single" w:sz="4" w:space="0" w:color="888888"/>
+              <w:insideV w:val="single" w:sz="4" w:space="0" w:color="888888"/>
+            </w:tcBorders>
+          </w:tcPr>
+          <w:p>
+            <w:r>
+              <w:rPr>
+                <w:sz w:val="16"/>
+              </w:rPr>
+              <w:t>Lithography, LASIK, angioplasty</w:t>
+            </w:r>
+          </w:p>
+        </w:tc>
+      </w:tr>
+      <w:tr>
+        <w:tc>
+          <w:tcPr>
+            <w:tcW w:type="dxa" w:w="2340"/>
+            <w:tcBorders>
+              <w:top w:val="single" w:sz="4" w:space="0" w:color="888888"/>
+              <w:bottom w:val="single" w:sz="4" w:space="0" w:color="888888"/>
+              <w:left w:val="single" w:sz="4" w:space="0" w:color="888888"/>
+              <w:right w:val="single" w:sz="4" w:space="0" w:color="888888"/>
+              <w:insideH w:val="single" w:sz="4" w:space="0" w:color="888888"/>
+              <w:insideV w:val="single" w:sz="4" w:space="0" w:color="888888"/>
+            </w:tcBorders>
+            <w:shd w:val="clear" w:color="auto" w:fill="F2F7FD"/>
+          </w:tcPr>
+          <w:p>
+            <w:r>
+              <w:rPr>
+                <w:sz w:val="16"/>
+              </w:rPr>
+              <w:t>Nd:YAG (solid)</w:t>
+            </w:r>
+          </w:p>
+        </w:tc>
+        <w:tc>
+          <w:tcPr>
+            <w:tcW w:type="dxa" w:w="2340"/>
+            <w:tcBorders>
+              <w:top w:val="single" w:sz="4" w:space="0" w:color="888888"/>
+              <w:bottom w:val="single" w:sz="4" w:space="0" w:color="888888"/>
+              <w:left w:val="single" w:sz="4" w:space="0" w:color="888888"/>
+              <w:right w:val="single" w:sz="4" w:space="0" w:color="888888"/>
+              <w:insideH w:val="single" w:sz="4" w:space="0" w:color="888888"/>
+              <w:insideV w:val="single" w:sz="4" w:space="0" w:color="888888"/>
+            </w:tcBorders>
+            <w:shd w:val="clear" w:color="auto" w:fill="F2F7FD"/>
+          </w:tcPr>
+          <w:p>
+            <w:r>
+              <w:rPr>
+                <w:sz w:val="16"/>
+              </w:rPr>
+              <w:t>1064 nm (+ harmonics)</w:t>
+            </w:r>
+          </w:p>
+        </w:tc>
+        <w:tc>
+          <w:tcPr>
+            <w:tcW w:type="dxa" w:w="2340"/>
+            <w:tcBorders>
+              <w:top w:val="single" w:sz="4" w:space="0" w:color="888888"/>
+              <w:bottom w:val="single" w:sz="4" w:space="0" w:color="888888"/>
+              <w:left w:val="single" w:sz="4" w:space="0" w:color="888888"/>
+              <w:right w:val="single" w:sz="4" w:space="0" w:color="888888"/>
+              <w:insideH w:val="single" w:sz="4" w:space="0" w:color="888888"/>
+              <w:insideV w:val="single" w:sz="4" w:space="0" w:color="888888"/>
+            </w:tcBorders>
+            <w:shd w:val="clear" w:color="auto" w:fill="F2F7FD"/>
+          </w:tcPr>
+          <w:p>
+            <w:r>
+              <w:rPr>
+                <w:sz w:val="16"/>
+              </w:rPr>
+              <w:t>mW – kW</w:t>
+            </w:r>
+          </w:p>
+        </w:tc>
+        <w:tc>
+          <w:tcPr>
+            <w:tcW w:type="dxa" w:w="2340"/>
+            <w:tcBorders>
+              <w:top w:val="single" w:sz="4" w:space="0" w:color="888888"/>
+              <w:bottom w:val="single" w:sz="4" w:space="0" w:color="888888"/>
+              <w:left w:val="single" w:sz="4" w:space="0" w:color="888888"/>
+              <w:right w:val="single" w:sz="4" w:space="0" w:color="888888"/>
+              <w:insideH w:val="single" w:sz="4" w:space="0" w:color="888888"/>
+              <w:insideV w:val="single" w:sz="4" w:space="0" w:color="888888"/>
+            </w:tcBorders>
+            <w:shd w:val="clear" w:color="auto" w:fill="F2F7FD"/>
+          </w:tcPr>
+          <w:p>
+            <w:r>
+              <w:rPr>
+                <w:sz w:val="16"/>
+              </w:rPr>
+              <w:t>Marking, welding, ophthalmology</w:t>
+            </w:r>
+          </w:p>
+        </w:tc>
+      </w:tr>
+      <w:tr>
+        <w:tc>
+          <w:tcPr>
+            <w:tcW w:type="dxa" w:w="2340"/>
+            <w:tcBorders>
+              <w:top w:val="single" w:sz="4" w:space="0" w:color="888888"/>
+              <w:bottom w:val="single" w:sz="4" w:space="0" w:color="888888"/>
+              <w:left w:val="single" w:sz="4" w:space="0" w:color="888888"/>
+              <w:right w:val="single" w:sz="4" w:space="0" w:color="888888"/>
+              <w:insideH w:val="single" w:sz="4" w:space="0" w:color="888888"/>
+              <w:insideV w:val="single" w:sz="4" w:space="0" w:color="888888"/>
+            </w:tcBorders>
+          </w:tcPr>
+          <w:p>
+            <w:r>
+              <w:rPr>
+                <w:sz w:val="16"/>
+              </w:rPr>
+              <w:t>Ti:Sapphire (solid)</w:t>
+            </w:r>
+          </w:p>
+        </w:tc>
+        <w:tc>
+          <w:tcPr>
+            <w:tcW w:type="dxa" w:w="2340"/>
+            <w:tcBorders>
+              <w:top w:val="single" w:sz="4" w:space="0" w:color="888888"/>
+              <w:bottom w:val="single" w:sz="4" w:space="0" w:color="888888"/>
+              <w:left w:val="single" w:sz="4" w:space="0" w:color="888888"/>
+              <w:right w:val="single" w:sz="4" w:space="0" w:color="888888"/>
+              <w:insideH w:val="single" w:sz="4" w:space="0" w:color="888888"/>
+              <w:insideV w:val="single" w:sz="4" w:space="0" w:color="888888"/>
+            </w:tcBorders>
+          </w:tcPr>
+          <w:p>
+            <w:r>
+              <w:rPr>
+                <w:sz w:val="16"/>
+              </w:rPr>
+              <w:t>650–1100 nm</w:t>
+            </w:r>
+          </w:p>
+        </w:tc>
+        <w:tc>
+          <w:tcPr>
+            <w:tcW w:type="dxa" w:w="2340"/>
+            <w:tcBorders>
+              <w:top w:val="single" w:sz="4" w:space="0" w:color="888888"/>
+              <w:bottom w:val="single" w:sz="4" w:space="0" w:color="888888"/>
+              <w:left w:val="single" w:sz="4" w:space="0" w:color="888888"/>
+              <w:right w:val="single" w:sz="4" w:space="0" w:color="888888"/>
+              <w:insideH w:val="single" w:sz="4" w:space="0" w:color="888888"/>
+              <w:insideV w:val="single" w:sz="4" w:space="0" w:color="888888"/>
+            </w:tcBorders>
+          </w:tcPr>
+          <w:p>
+            <w:r>
+              <w:rPr>
+                <w:sz w:val="16"/>
+              </w:rPr>
+              <w:t>pJ – PW (pulsed)</w:t>
+            </w:r>
+          </w:p>
+        </w:tc>
+        <w:tc>
+          <w:tcPr>
+            <w:tcW w:type="dxa" w:w="2340"/>
+            <w:tcBorders>
+              <w:top w:val="single" w:sz="4" w:space="0" w:color="888888"/>
+              <w:bottom w:val="single" w:sz="4" w:space="0" w:color="888888"/>
+              <w:left w:val="single" w:sz="4" w:space="0" w:color="888888"/>
+              <w:right w:val="single" w:sz="4" w:space="0" w:color="888888"/>
+              <w:insideH w:val="single" w:sz="4" w:space="0" w:color="888888"/>
+              <w:insideV w:val="single" w:sz="4" w:space="0" w:color="888888"/>
+            </w:tcBorders>
+          </w:tcPr>
+          <w:p>
+            <w:r>
+              <w:rPr>
+                <w:sz w:val="16"/>
+              </w:rPr>
+              <w:t>Ultrafast science, spectroscopy</w:t>
+            </w:r>
+          </w:p>
+        </w:tc>
+      </w:tr>
+      <w:tr>
+        <w:tc>
+          <w:tcPr>
+            <w:tcW w:type="dxa" w:w="2340"/>
+            <w:tcBorders>
+              <w:top w:val="single" w:sz="4" w:space="0" w:color="888888"/>
+              <w:bottom w:val="single" w:sz="4" w:space="0" w:color="888888"/>
+              <w:left w:val="single" w:sz="4" w:space="0" w:color="888888"/>
+              <w:right w:val="single" w:sz="4" w:space="0" w:color="888888"/>
+              <w:insideH w:val="single" w:sz="4" w:space="0" w:color="888888"/>
+              <w:insideV w:val="single" w:sz="4" w:space="0" w:color="888888"/>
+            </w:tcBorders>
+            <w:shd w:val="clear" w:color="auto" w:fill="F2F7FD"/>
+          </w:tcPr>
+          <w:p>
+            <w:r>
+              <w:rPr>
+                <w:sz w:val="16"/>
+              </w:rPr>
+              <w:t>Diode / VCSEL</w:t>
+            </w:r>
+          </w:p>
+        </w:tc>
+        <w:tc>
+          <w:tcPr>
+            <w:tcW w:type="dxa" w:w="2340"/>
+            <w:tcBorders>
+              <w:top w:val="single" w:sz="4" w:space="0" w:color="888888"/>
+              <w:bottom w:val="single" w:sz="4" w:space="0" w:color="888888"/>
+              <w:left w:val="single" w:sz="4" w:space="0" w:color="888888"/>
+              <w:right w:val="single" w:sz="4" w:space="0" w:color="888888"/>
+              <w:insideH w:val="single" w:sz="4" w:space="0" w:color="888888"/>
+              <w:insideV w:val="single" w:sz="4" w:space="0" w:color="888888"/>
+            </w:tcBorders>
+            <w:shd w:val="clear" w:color="auto" w:fill="F2F7FD"/>
+          </w:tcPr>
+          <w:p>
+            <w:r>
+              <w:rPr>
+                <w:sz w:val="16"/>
+              </w:rPr>
+              <w:t>375 nm – 2 µm</w:t>
+            </w:r>
+          </w:p>
+        </w:tc>
+        <w:tc>
+          <w:tcPr>
+            <w:tcW w:type="dxa" w:w="2340"/>
+            <w:tcBorders>
+              <w:top w:val="single" w:sz="4" w:space="0" w:color="888888"/>
+              <w:bottom w:val="single" w:sz="4" w:space="0" w:color="888888"/>
+              <w:left w:val="single" w:sz="4" w:space="0" w:color="888888"/>
+              <w:right w:val="single" w:sz="4" w:space="0" w:color="888888"/>
+              <w:insideH w:val="single" w:sz="4" w:space="0" w:color="888888"/>
+              <w:insideV w:val="single" w:sz="4" w:space="0" w:color="888888"/>
+            </w:tcBorders>
+            <w:shd w:val="clear" w:color="auto" w:fill="F2F7FD"/>
+          </w:tcPr>
+          <w:p>
+            <w:r>
+              <w:rPr>
+                <w:sz w:val="16"/>
+              </w:rPr>
+              <w:t>µW – 20 kW (array)</w:t>
+            </w:r>
+          </w:p>
+        </w:tc>
+        <w:tc>
+          <w:tcPr>
+            <w:tcW w:type="dxa" w:w="2340"/>
+            <w:tcBorders>
+              <w:top w:val="single" w:sz="4" w:space="0" w:color="888888"/>
+              <w:bottom w:val="single" w:sz="4" w:space="0" w:color="888888"/>
+              <w:left w:val="single" w:sz="4" w:space="0" w:color="888888"/>
+              <w:right w:val="single" w:sz="4" w:space="0" w:color="888888"/>
+              <w:insideH w:val="single" w:sz="4" w:space="0" w:color="888888"/>
+              <w:insideV w:val="single" w:sz="4" w:space="0" w:color="888888"/>
+            </w:tcBorders>
+            <w:shd w:val="clear" w:color="auto" w:fill="F2F7FD"/>
+          </w:tcPr>
+          <w:p>
+            <w:r>
+              <w:rPr>
+                <w:sz w:val="16"/>
+              </w:rPr>
+              <w:t>Telecom, sensing, pumping, displays</w:t>
+            </w:r>
+          </w:p>
+        </w:tc>
+      </w:tr>
+      <w:tr>
+        <w:tc>
+          <w:tcPr>
+            <w:tcW w:type="dxa" w:w="2340"/>
+            <w:tcBorders>
+              <w:top w:val="single" w:sz="4" w:space="0" w:color="888888"/>
+              <w:bottom w:val="single" w:sz="4" w:space="0" w:color="888888"/>
+              <w:left w:val="single" w:sz="4" w:space="0" w:color="888888"/>
+              <w:right w:val="single" w:sz="4" w:space="0" w:color="888888"/>
+              <w:insideH w:val="single" w:sz="4" w:space="0" w:color="888888"/>
+              <w:insideV w:val="single" w:sz="4" w:space="0" w:color="888888"/>
+            </w:tcBorders>
+          </w:tcPr>
+          <w:p>
+            <w:r>
+              <w:rPr>
+                <w:sz w:val="16"/>
+              </w:rPr>
+              <w:t>Fiber (Yb/Er)</w:t>
+            </w:r>
+          </w:p>
+        </w:tc>
+        <w:tc>
+          <w:tcPr>
+            <w:tcW w:type="dxa" w:w="2340"/>
+            <w:tcBorders>
+              <w:top w:val="single" w:sz="4" w:space="0" w:color="888888"/>
+              <w:bottom w:val="single" w:sz="4" w:space="0" w:color="888888"/>
+              <w:left w:val="single" w:sz="4" w:space="0" w:color="888888"/>
+              <w:right w:val="single" w:sz="4" w:space="0" w:color="888888"/>
+              <w:insideH w:val="single" w:sz="4" w:space="0" w:color="888888"/>
+              <w:insideV w:val="single" w:sz="4" w:space="0" w:color="888888"/>
+            </w:tcBorders>
+          </w:tcPr>
+          <w:p>
+            <w:r>
+              <w:rPr>
+                <w:sz w:val="16"/>
+              </w:rPr>
+              <w:t>1030–1090 / 1550 nm</w:t>
+            </w:r>
+          </w:p>
+        </w:tc>
+        <w:tc>
+          <w:tcPr>
+            <w:tcW w:type="dxa" w:w="2340"/>
+            <w:tcBorders>
+              <w:top w:val="single" w:sz="4" w:space="0" w:color="888888"/>
+              <w:bottom w:val="single" w:sz="4" w:space="0" w:color="888888"/>
+              <w:left w:val="single" w:sz="4" w:space="0" w:color="888888"/>
+              <w:right w:val="single" w:sz="4" w:space="0" w:color="888888"/>
+              <w:insideH w:val="single" w:sz="4" w:space="0" w:color="888888"/>
+              <w:insideV w:val="single" w:sz="4" w:space="0" w:color="888888"/>
+            </w:tcBorders>
+          </w:tcPr>
+          <w:p>
+            <w:r>
+              <w:rPr>
+                <w:sz w:val="16"/>
+              </w:rPr>
+              <w:t>mW – 20 kW</w:t>
+            </w:r>
+          </w:p>
+        </w:tc>
+        <w:tc>
+          <w:tcPr>
+            <w:tcW w:type="dxa" w:w="2340"/>
+            <w:tcBorders>
+              <w:top w:val="single" w:sz="4" w:space="0" w:color="888888"/>
+              <w:bottom w:val="single" w:sz="4" w:space="0" w:color="888888"/>
+              <w:left w:val="single" w:sz="4" w:space="0" w:color="888888"/>
+              <w:right w:val="single" w:sz="4" w:space="0" w:color="888888"/>
+              <w:insideH w:val="single" w:sz="4" w:space="0" w:color="888888"/>
+              <w:insideV w:val="single" w:sz="4" w:space="0" w:color="888888"/>
+            </w:tcBorders>
+          </w:tcPr>
+          <w:p>
+            <w:r>
+              <w:rPr>
+                <w:sz w:val="16"/>
+              </w:rPr>
+              <w:t>Cutting, welding, telecom amplifiers</w:t>
+            </w:r>
+          </w:p>
+        </w:tc>
+      </w:tr>
+      <w:tr>
+        <w:tc>
+          <w:tcPr>
+            <w:tcW w:type="dxa" w:w="2340"/>
+            <w:tcBorders>
+              <w:top w:val="single" w:sz="4" w:space="0" w:color="888888"/>
+              <w:bottom w:val="single" w:sz="4" w:space="0" w:color="888888"/>
+              <w:left w:val="single" w:sz="4" w:space="0" w:color="888888"/>
+              <w:right w:val="single" w:sz="4" w:space="0" w:color="888888"/>
+              <w:insideH w:val="single" w:sz="4" w:space="0" w:color="888888"/>
+              <w:insideV w:val="single" w:sz="4" w:space="0" w:color="888888"/>
+            </w:tcBorders>
+            <w:shd w:val="clear" w:color="auto" w:fill="F2F7FD"/>
+          </w:tcPr>
+          <w:p>
+            <w:r>
+              <w:rPr>
+                <w:sz w:val="16"/>
+              </w:rPr>
+              <w:t>Dye (liquid)</w:t>
+            </w:r>
+          </w:p>
+        </w:tc>
+        <w:tc>
+          <w:tcPr>
+            <w:tcW w:type="dxa" w:w="2340"/>
+            <w:tcBorders>
+              <w:top w:val="single" w:sz="4" w:space="0" w:color="888888"/>
+              <w:bottom w:val="single" w:sz="4" w:space="0" w:color="888888"/>
+              <w:left w:val="single" w:sz="4" w:space="0" w:color="888888"/>
+              <w:right w:val="single" w:sz="4" w:space="0" w:color="888888"/>
+              <w:insideH w:val="single" w:sz="4" w:space="0" w:color="888888"/>
+              <w:insideV w:val="single" w:sz="4" w:space="0" w:color="888888"/>
+            </w:tcBorders>
+            <w:shd w:val="clear" w:color="auto" w:fill="F2F7FD"/>
+          </w:tcPr>
+          <w:p>
+            <w:r>
+              <w:rPr>
+                <w:sz w:val="16"/>
+              </w:rPr>
+              <w:t>~400–950 nm (tunable)</w:t>
+            </w:r>
+          </w:p>
+        </w:tc>
+        <w:tc>
+          <w:tcPr>
+            <w:tcW w:type="dxa" w:w="2340"/>
+            <w:tcBorders>
+              <w:top w:val="single" w:sz="4" w:space="0" w:color="888888"/>
+              <w:bottom w:val="single" w:sz="4" w:space="0" w:color="888888"/>
+              <w:left w:val="single" w:sz="4" w:space="0" w:color="888888"/>
+              <w:right w:val="single" w:sz="4" w:space="0" w:color="888888"/>
+              <w:insideH w:val="single" w:sz="4" w:space="0" w:color="888888"/>
+              <w:insideV w:val="single" w:sz="4" w:space="0" w:color="888888"/>
+            </w:tcBorders>
+            <w:shd w:val="clear" w:color="auto" w:fill="F2F7FD"/>
+          </w:tcPr>
+          <w:p>
+            <w:r>
+              <w:rPr>
+                <w:sz w:val="16"/>
+              </w:rPr>
+              <w:t>mW – W (CW)</w:t>
+            </w:r>
+          </w:p>
+        </w:tc>
+        <w:tc>
+          <w:tcPr>
+            <w:tcW w:type="dxa" w:w="2340"/>
+            <w:tcBorders>
+              <w:top w:val="single" w:sz="4" w:space="0" w:color="888888"/>
+              <w:bottom w:val="single" w:sz="4" w:space="0" w:color="888888"/>
+              <w:left w:val="single" w:sz="4" w:space="0" w:color="888888"/>
+              <w:right w:val="single" w:sz="4" w:space="0" w:color="888888"/>
+              <w:insideH w:val="single" w:sz="4" w:space="0" w:color="888888"/>
+              <w:insideV w:val="single" w:sz="4" w:space="0" w:color="888888"/>
+            </w:tcBorders>
+            <w:shd w:val="clear" w:color="auto" w:fill="F2F7FD"/>
+          </w:tcPr>
+          <w:p>
+            <w:r>
+              <w:rPr>
+                <w:sz w:val="16"/>
+              </w:rPr>
+              <w:t>Spectroscopy, isotope separation</w:t>
+            </w:r>
+          </w:p>
+        </w:tc>
+      </w:tr>
+      <w:tr>
+        <w:tc>
+          <w:tcPr>
+            <w:tcW w:type="dxa" w:w="2340"/>
+            <w:tcBorders>
+              <w:top w:val="single" w:sz="4" w:space="0" w:color="888888"/>
+              <w:bottom w:val="single" w:sz="4" w:space="0" w:color="888888"/>
+              <w:left w:val="single" w:sz="4" w:space="0" w:color="888888"/>
+              <w:right w:val="single" w:sz="4" w:space="0" w:color="888888"/>
+              <w:insideH w:val="single" w:sz="4" w:space="0" w:color="888888"/>
+              <w:insideV w:val="single" w:sz="4" w:space="0" w:color="888888"/>
+            </w:tcBorders>
+          </w:tcPr>
+          <w:p>
+            <w:r>
+              <w:rPr>
+                <w:sz w:val="16"/>
+              </w:rPr>
+              <w:t>Free-Electron</w:t>
+            </w:r>
+          </w:p>
+        </w:tc>
+        <w:tc>
+          <w:tcPr>
+            <w:tcW w:type="dxa" w:w="2340"/>
+            <w:tcBorders>
+              <w:top w:val="single" w:sz="4" w:space="0" w:color="888888"/>
+              <w:bottom w:val="single" w:sz="4" w:space="0" w:color="888888"/>
+              <w:left w:val="single" w:sz="4" w:space="0" w:color="888888"/>
+              <w:right w:val="single" w:sz="4" w:space="0" w:color="888888"/>
+              <w:insideH w:val="single" w:sz="4" w:space="0" w:color="888888"/>
+              <w:insideV w:val="single" w:sz="4" w:space="0" w:color="888888"/>
+            </w:tcBorders>
+          </w:tcPr>
+          <w:p>
+            <w:r>
+              <w:rPr>
+                <w:sz w:val="16"/>
+              </w:rPr>
+              <w:t>IR – hard X-ray</w:t>
+            </w:r>
+          </w:p>
+        </w:tc>
+        <w:tc>
+          <w:tcPr>
+            <w:tcW w:type="dxa" w:w="2340"/>
+            <w:tcBorders>
+              <w:top w:val="single" w:sz="4" w:space="0" w:color="888888"/>
+              <w:bottom w:val="single" w:sz="4" w:space="0" w:color="888888"/>
+              <w:left w:val="single" w:sz="4" w:space="0" w:color="888888"/>
+              <w:right w:val="single" w:sz="4" w:space="0" w:color="888888"/>
+              <w:insideH w:val="single" w:sz="4" w:space="0" w:color="888888"/>
+              <w:insideV w:val="single" w:sz="4" w:space="0" w:color="888888"/>
+            </w:tcBorders>
+          </w:tcPr>
+          <w:p>
+            <w:r>
+              <w:rPr>
+                <w:sz w:val="16"/>
+              </w:rPr>
+              <w:t>GW peak (pulsed)</w:t>
+            </w:r>
+          </w:p>
+        </w:tc>
+        <w:tc>
+          <w:tcPr>
+            <w:tcW w:type="dxa" w:w="2340"/>
+            <w:tcBorders>
+              <w:top w:val="single" w:sz="4" w:space="0" w:color="888888"/>
+              <w:bottom w:val="single" w:sz="4" w:space="0" w:color="888888"/>
+              <w:left w:val="single" w:sz="4" w:space="0" w:color="888888"/>
+              <w:right w:val="single" w:sz="4" w:space="0" w:color="888888"/>
+              <w:insideH w:val="single" w:sz="4" w:space="0" w:color="888888"/>
+              <w:insideV w:val="single" w:sz="4" w:space="0" w:color="888888"/>
+            </w:tcBorders>
+          </w:tcPr>
+          <w:p>
+            <w:r>
+              <w:rPr>
+                <w:sz w:val="16"/>
+              </w:rPr>
+              <w:t>Structural biology, materials science</w:t>
+            </w:r>
+          </w:p>
+        </w:tc>
+      </w:tr>
+    </w:tbl>
+    <w:p>
+      <w:pPr>
+        <w:jc w:val="center"/>
+      </w:pPr>
+      <w:r>
+        <w:rPr>
+          <w:i/>
+          <w:color w:val="444444"/>
+          <w:sz w:val="17"/>
+        </w:rPr>
+        <w:t>Table 2: Comparative summary of principal laser types and their primary applications.</w:t>
+      </w:r>
+    </w:p>
+    <w:p>
+      <w:pPr>
+        <w:spacing w:before="0" w:after="80"/>
+      </w:pPr>
     </w:p>
     <w:p>
       <w:r>
@@ -788,6 +2651,71 @@
         </w:rPr>
         <w:t xml:space="preserve">The outcome of laser irradiation depends on absorbed irradiance, pulse duration, and the optical and thermal properties of the target material. Four regimes are distinguished: thermal, ultrashort-pulse, photochemical, and nonlinear.</w:t>
       </w:r>
+      <w:r>
+        <w:t xml:space="preserve"> Figure 4 maps these interaction regimes on axes of peak irradiance versus pulse duration, together with representative laser operating points.</w:t>
+      </w:r>
+    </w:p>
+    <w:p>
+      <w:pPr>
+        <w:spacing w:before="0" w:after="80"/>
+      </w:pPr>
+    </w:p>
+    <w:p>
+      <w:pPr>
+        <w:jc w:val="center"/>
+      </w:pPr>
+      <w:r>
+        <w:drawing>
+          <wp:inline xmlns:a="http://schemas.openxmlformats.org/drawingml/2006/main" xmlns:pic="http://schemas.openxmlformats.org/drawingml/2006/picture">
+            <wp:extent cx="5303520" cy="2387419"/>
+            <wp:docPr id="4" name="Picture 4"/>
+            <wp:cNvGraphicFramePr>
+              <a:graphicFrameLocks noChangeAspect="1"/>
+            </wp:cNvGraphicFramePr>
+            <a:graphic>
+              <a:graphicData uri="http://schemas.openxmlformats.org/drawingml/2006/picture">
+                <pic:pic>
+                  <pic:nvPicPr>
+                    <pic:cNvPr id="0" name="fig4_interaction_regimes.png"/>
+                    <pic:cNvPicPr/>
+                  </pic:nvPicPr>
+                  <pic:blipFill>
+                    <a:blip r:embed="rId11"/>
+                    <a:stretch>
+                      <a:fillRect/>
+                    </a:stretch>
+                  </pic:blipFill>
+                  <pic:spPr>
+                    <a:xfrm>
+                      <a:off x="0" y="0"/>
+                      <a:ext cx="5303520" cy="2387419"/>
+                    </a:xfrm>
+                    <a:prstGeom prst="rect"/>
+                  </pic:spPr>
+                </pic:pic>
+              </a:graphicData>
+            </a:graphic>
+          </wp:inline>
+        </w:drawing>
+      </w:r>
+    </w:p>
+    <w:p>
+      <w:pPr>
+        <w:jc w:val="center"/>
+      </w:pPr>
+      <w:r>
+        <w:rPr>
+          <w:i/>
+          <w:color w:val="444444"/>
+          <w:sz w:val="17"/>
+        </w:rPr>
+        <w:t>Figure 4: Laser–material interaction regime map as a function of peak irradiance and pulse duration. Coloured regions indicate the dominant physical mechanism; symbols mark representative operating points for common laser types.</w:t>
+      </w:r>
+    </w:p>
+    <w:p>
+      <w:pPr>
+        <w:spacing w:before="0" w:after="80"/>
+      </w:pPr>
     </w:p>
     <w:p>
       <w:pPr>
@@ -920,6 +2848,71 @@
         </w:rPr>
         <w:t xml:space="preserve">Lasers are ubiquitous across manufacturing, medicine, telecommunications, sensing, defence, and consumer products. The following subsections survey the most economically and technologically significant deployments.</w:t>
       </w:r>
+      <w:r>
+        <w:t xml:space="preserve"> Figure 5 illustrates the power ranges associated with each major application domain.</w:t>
+      </w:r>
+    </w:p>
+    <w:p>
+      <w:pPr>
+        <w:spacing w:before="0" w:after="80"/>
+      </w:pPr>
+    </w:p>
+    <w:p>
+      <w:pPr>
+        <w:jc w:val="center"/>
+      </w:pPr>
+      <w:r>
+        <w:drawing>
+          <wp:inline xmlns:a="http://schemas.openxmlformats.org/drawingml/2006/main" xmlns:pic="http://schemas.openxmlformats.org/drawingml/2006/picture">
+            <wp:extent cx="5303520" cy="2208877"/>
+            <wp:docPr id="5" name="Picture 5"/>
+            <wp:cNvGraphicFramePr>
+              <a:graphicFrameLocks noChangeAspect="1"/>
+            </wp:cNvGraphicFramePr>
+            <a:graphic>
+              <a:graphicData uri="http://schemas.openxmlformats.org/drawingml/2006/picture">
+                <pic:pic>
+                  <pic:nvPicPr>
+                    <pic:cNvPr id="0" name="fig5_application_domains.png"/>
+                    <pic:cNvPicPr/>
+                  </pic:nvPicPr>
+                  <pic:blipFill>
+                    <a:blip r:embed="rId12"/>
+                    <a:stretch>
+                      <a:fillRect/>
+                    </a:stretch>
+                  </pic:blipFill>
+                  <pic:spPr>
+                    <a:xfrm>
+                      <a:off x="0" y="0"/>
+                      <a:ext cx="5303520" cy="2208877"/>
+                    </a:xfrm>
+                    <a:prstGeom prst="rect"/>
+                  </pic:spPr>
+                </pic:pic>
+              </a:graphicData>
+            </a:graphic>
+          </wp:inline>
+        </w:drawing>
+      </w:r>
+    </w:p>
+    <w:p>
+      <w:pPr>
+        <w:jc w:val="center"/>
+      </w:pPr>
+      <w:r>
+        <w:rPr>
+          <w:i/>
+          <w:color w:val="444444"/>
+          <w:sz w:val="17"/>
+        </w:rPr>
+        <w:t>Figure 5: Typical output power ranges for major laser application domains. Applications span more than eight orders of magnitude in power, from milliwatt telecom sources to hundred-kilowatt directed-energy systems.</w:t>
+      </w:r>
+    </w:p>
+    <w:p>
+      <w:pPr>
+        <w:spacing w:before="0" w:after="80"/>
+      </w:pPr>
     </w:p>
     <w:p>
       <w:pPr>
@@ -1253,6 +3246,752 @@
         </w:rPr>
         <w:t xml:space="preserve">Class 4 — above 500 mW or high pulse energy; hazard to eye and skin, fire risk; encompasses industrial cutting systems, surgical lasers, and military directed-energy platforms.</w:t>
       </w:r>
+      <w:r>
+        <w:t xml:space="preserve"> Table 3 summarises the full IEC 60825-1 / ANSI Z136.1 classification hierarchy.</w:t>
+      </w:r>
+    </w:p>
+    <w:p>
+      <w:pPr>
+        <w:spacing w:before="0" w:after="80"/>
+      </w:pPr>
+    </w:p>
+    <w:tbl>
+      <w:tblPr>
+        <w:tblW w:type="auto" w:w="0"/>
+        <w:tblLook w:firstColumn="1" w:firstRow="1" w:lastColumn="0" w:lastRow="0" w:noHBand="0" w:noVBand="1" w:val="04A0"/>
+      </w:tblPr>
+      <w:tblGrid>
+        <w:gridCol w:w="2340"/>
+        <w:gridCol w:w="2340"/>
+        <w:gridCol w:w="2340"/>
+        <w:gridCol w:w="2340"/>
+      </w:tblGrid>
+      <w:tr>
+        <w:tc>
+          <w:tcPr>
+            <w:tcW w:type="dxa" w:w="2340"/>
+            <w:shd w:val="clear" w:color="auto" w:fill="BDD7EE"/>
+            <w:tcBorders>
+              <w:top w:val="single" w:sz="4" w:space="0" w:color="888888"/>
+              <w:bottom w:val="single" w:sz="4" w:space="0" w:color="888888"/>
+              <w:left w:val="single" w:sz="4" w:space="0" w:color="888888"/>
+              <w:right w:val="single" w:sz="4" w:space="0" w:color="888888"/>
+              <w:insideH w:val="single" w:sz="4" w:space="0" w:color="888888"/>
+              <w:insideV w:val="single" w:sz="4" w:space="0" w:color="888888"/>
+            </w:tcBorders>
+          </w:tcPr>
+          <w:p>
+            <w:r>
+              <w:rPr>
+                <w:b/>
+                <w:sz w:val="16"/>
+              </w:rPr>
+              <w:t>Class</w:t>
+            </w:r>
+          </w:p>
+        </w:tc>
+        <w:tc>
+          <w:tcPr>
+            <w:tcW w:type="dxa" w:w="2340"/>
+            <w:shd w:val="clear" w:color="auto" w:fill="BDD7EE"/>
+            <w:tcBorders>
+              <w:top w:val="single" w:sz="4" w:space="0" w:color="888888"/>
+              <w:bottom w:val="single" w:sz="4" w:space="0" w:color="888888"/>
+              <w:left w:val="single" w:sz="4" w:space="0" w:color="888888"/>
+              <w:right w:val="single" w:sz="4" w:space="0" w:color="888888"/>
+              <w:insideH w:val="single" w:sz="4" w:space="0" w:color="888888"/>
+              <w:insideV w:val="single" w:sz="4" w:space="0" w:color="888888"/>
+            </w:tcBorders>
+          </w:tcPr>
+          <w:p>
+            <w:r>
+              <w:rPr>
+                <w:b/>
+                <w:sz w:val="16"/>
+              </w:rPr>
+              <w:t>Risk Level</w:t>
+            </w:r>
+          </w:p>
+        </w:tc>
+        <w:tc>
+          <w:tcPr>
+            <w:tcW w:type="dxa" w:w="2340"/>
+            <w:shd w:val="clear" w:color="auto" w:fill="BDD7EE"/>
+            <w:tcBorders>
+              <w:top w:val="single" w:sz="4" w:space="0" w:color="888888"/>
+              <w:bottom w:val="single" w:sz="4" w:space="0" w:color="888888"/>
+              <w:left w:val="single" w:sz="4" w:space="0" w:color="888888"/>
+              <w:right w:val="single" w:sz="4" w:space="0" w:color="888888"/>
+              <w:insideH w:val="single" w:sz="4" w:space="0" w:color="888888"/>
+              <w:insideV w:val="single" w:sz="4" w:space="0" w:color="888888"/>
+            </w:tcBorders>
+          </w:tcPr>
+          <w:p>
+            <w:r>
+              <w:rPr>
+                <w:b/>
+                <w:sz w:val="16"/>
+              </w:rPr>
+              <w:t>Accessible Power / Energy</w:t>
+            </w:r>
+          </w:p>
+        </w:tc>
+        <w:tc>
+          <w:tcPr>
+            <w:tcW w:type="dxa" w:w="2340"/>
+            <w:shd w:val="clear" w:color="auto" w:fill="BDD7EE"/>
+            <w:tcBorders>
+              <w:top w:val="single" w:sz="4" w:space="0" w:color="888888"/>
+              <w:bottom w:val="single" w:sz="4" w:space="0" w:color="888888"/>
+              <w:left w:val="single" w:sz="4" w:space="0" w:color="888888"/>
+              <w:right w:val="single" w:sz="4" w:space="0" w:color="888888"/>
+              <w:insideH w:val="single" w:sz="4" w:space="0" w:color="888888"/>
+              <w:insideV w:val="single" w:sz="4" w:space="0" w:color="888888"/>
+            </w:tcBorders>
+          </w:tcPr>
+          <w:p>
+            <w:r>
+              <w:rPr>
+                <w:b/>
+                <w:sz w:val="16"/>
+              </w:rPr>
+              <w:t>Typical Examples</w:t>
+            </w:r>
+          </w:p>
+        </w:tc>
+      </w:tr>
+      <w:tr>
+        <w:tc>
+          <w:tcPr>
+            <w:tcW w:type="dxa" w:w="2340"/>
+            <w:tcBorders>
+              <w:top w:val="single" w:sz="4" w:space="0" w:color="888888"/>
+              <w:bottom w:val="single" w:sz="4" w:space="0" w:color="888888"/>
+              <w:left w:val="single" w:sz="4" w:space="0" w:color="888888"/>
+              <w:right w:val="single" w:sz="4" w:space="0" w:color="888888"/>
+              <w:insideH w:val="single" w:sz="4" w:space="0" w:color="888888"/>
+              <w:insideV w:val="single" w:sz="4" w:space="0" w:color="888888"/>
+            </w:tcBorders>
+          </w:tcPr>
+          <w:p>
+            <w:r>
+              <w:rPr>
+                <w:sz w:val="16"/>
+              </w:rPr>
+              <w:t>1</w:t>
+            </w:r>
+          </w:p>
+        </w:tc>
+        <w:tc>
+          <w:tcPr>
+            <w:tcW w:type="dxa" w:w="2340"/>
+            <w:tcBorders>
+              <w:top w:val="single" w:sz="4" w:space="0" w:color="888888"/>
+              <w:bottom w:val="single" w:sz="4" w:space="0" w:color="888888"/>
+              <w:left w:val="single" w:sz="4" w:space="0" w:color="888888"/>
+              <w:right w:val="single" w:sz="4" w:space="0" w:color="888888"/>
+              <w:insideH w:val="single" w:sz="4" w:space="0" w:color="888888"/>
+              <w:insideV w:val="single" w:sz="4" w:space="0" w:color="888888"/>
+            </w:tcBorders>
+          </w:tcPr>
+          <w:p>
+            <w:r>
+              <w:rPr>
+                <w:sz w:val="16"/>
+              </w:rPr>
+              <w:t>Safe under all foreseeable conditions</w:t>
+            </w:r>
+          </w:p>
+        </w:tc>
+        <w:tc>
+          <w:tcPr>
+            <w:tcW w:type="dxa" w:w="2340"/>
+            <w:tcBorders>
+              <w:top w:val="single" w:sz="4" w:space="0" w:color="888888"/>
+              <w:bottom w:val="single" w:sz="4" w:space="0" w:color="888888"/>
+              <w:left w:val="single" w:sz="4" w:space="0" w:color="888888"/>
+              <w:right w:val="single" w:sz="4" w:space="0" w:color="888888"/>
+              <w:insideH w:val="single" w:sz="4" w:space="0" w:color="888888"/>
+              <w:insideV w:val="single" w:sz="4" w:space="0" w:color="888888"/>
+            </w:tcBorders>
+          </w:tcPr>
+          <w:p>
+            <w:r>
+              <w:rPr>
+                <w:sz w:val="16"/>
+              </w:rPr>
+              <w:t>Inherently safe or enclosed</w:t>
+            </w:r>
+          </w:p>
+        </w:tc>
+        <w:tc>
+          <w:tcPr>
+            <w:tcW w:type="dxa" w:w="2340"/>
+            <w:tcBorders>
+              <w:top w:val="single" w:sz="4" w:space="0" w:color="888888"/>
+              <w:bottom w:val="single" w:sz="4" w:space="0" w:color="888888"/>
+              <w:left w:val="single" w:sz="4" w:space="0" w:color="888888"/>
+              <w:right w:val="single" w:sz="4" w:space="0" w:color="888888"/>
+              <w:insideH w:val="single" w:sz="4" w:space="0" w:color="888888"/>
+              <w:insideV w:val="single" w:sz="4" w:space="0" w:color="888888"/>
+            </w:tcBorders>
+          </w:tcPr>
+          <w:p>
+            <w:r>
+              <w:rPr>
+                <w:sz w:val="16"/>
+              </w:rPr>
+              <w:t>Laser printers, CD/DVD drives</w:t>
+            </w:r>
+          </w:p>
+        </w:tc>
+      </w:tr>
+      <w:tr>
+        <w:tc>
+          <w:tcPr>
+            <w:tcW w:type="dxa" w:w="2340"/>
+            <w:tcBorders>
+              <w:top w:val="single" w:sz="4" w:space="0" w:color="888888"/>
+              <w:bottom w:val="single" w:sz="4" w:space="0" w:color="888888"/>
+              <w:left w:val="single" w:sz="4" w:space="0" w:color="888888"/>
+              <w:right w:val="single" w:sz="4" w:space="0" w:color="888888"/>
+              <w:insideH w:val="single" w:sz="4" w:space="0" w:color="888888"/>
+              <w:insideV w:val="single" w:sz="4" w:space="0" w:color="888888"/>
+            </w:tcBorders>
+            <w:shd w:val="clear" w:color="auto" w:fill="F2F7FD"/>
+          </w:tcPr>
+          <w:p>
+            <w:r>
+              <w:rPr>
+                <w:sz w:val="16"/>
+              </w:rPr>
+              <w:t>1M</w:t>
+            </w:r>
+          </w:p>
+        </w:tc>
+        <w:tc>
+          <w:tcPr>
+            <w:tcW w:type="dxa" w:w="2340"/>
+            <w:tcBorders>
+              <w:top w:val="single" w:sz="4" w:space="0" w:color="888888"/>
+              <w:bottom w:val="single" w:sz="4" w:space="0" w:color="888888"/>
+              <w:left w:val="single" w:sz="4" w:space="0" w:color="888888"/>
+              <w:right w:val="single" w:sz="4" w:space="0" w:color="888888"/>
+              <w:insideH w:val="single" w:sz="4" w:space="0" w:color="888888"/>
+              <w:insideV w:val="single" w:sz="4" w:space="0" w:color="888888"/>
+            </w:tcBorders>
+            <w:shd w:val="clear" w:color="auto" w:fill="F2F7FD"/>
+          </w:tcPr>
+          <w:p>
+            <w:r>
+              <w:rPr>
+                <w:sz w:val="16"/>
+              </w:rPr>
+              <w:t>Safe without magnifying optics</w:t>
+            </w:r>
+          </w:p>
+        </w:tc>
+        <w:tc>
+          <w:tcPr>
+            <w:tcW w:type="dxa" w:w="2340"/>
+            <w:tcBorders>
+              <w:top w:val="single" w:sz="4" w:space="0" w:color="888888"/>
+              <w:bottom w:val="single" w:sz="4" w:space="0" w:color="888888"/>
+              <w:left w:val="single" w:sz="4" w:space="0" w:color="888888"/>
+              <w:right w:val="single" w:sz="4" w:space="0" w:color="888888"/>
+              <w:insideH w:val="single" w:sz="4" w:space="0" w:color="888888"/>
+              <w:insideV w:val="single" w:sz="4" w:space="0" w:color="888888"/>
+            </w:tcBorders>
+            <w:shd w:val="clear" w:color="auto" w:fill="F2F7FD"/>
+          </w:tcPr>
+          <w:p>
+            <w:r>
+              <w:rPr>
+                <w:sz w:val="16"/>
+              </w:rPr>
+              <w:t>Low power, large or divergent beam</w:t>
+            </w:r>
+          </w:p>
+        </w:tc>
+        <w:tc>
+          <w:tcPr>
+            <w:tcW w:type="dxa" w:w="2340"/>
+            <w:tcBorders>
+              <w:top w:val="single" w:sz="4" w:space="0" w:color="888888"/>
+              <w:bottom w:val="single" w:sz="4" w:space="0" w:color="888888"/>
+              <w:left w:val="single" w:sz="4" w:space="0" w:color="888888"/>
+              <w:right w:val="single" w:sz="4" w:space="0" w:color="888888"/>
+              <w:insideH w:val="single" w:sz="4" w:space="0" w:color="888888"/>
+              <w:insideV w:val="single" w:sz="4" w:space="0" w:color="888888"/>
+            </w:tcBorders>
+            <w:shd w:val="clear" w:color="auto" w:fill="F2F7FD"/>
+          </w:tcPr>
+          <w:p>
+            <w:r>
+              <w:rPr>
+                <w:sz w:val="16"/>
+              </w:rPr>
+              <w:t>Fibre sources, alignment tools</w:t>
+            </w:r>
+          </w:p>
+        </w:tc>
+      </w:tr>
+      <w:tr>
+        <w:tc>
+          <w:tcPr>
+            <w:tcW w:type="dxa" w:w="2340"/>
+            <w:tcBorders>
+              <w:top w:val="single" w:sz="4" w:space="0" w:color="888888"/>
+              <w:bottom w:val="single" w:sz="4" w:space="0" w:color="888888"/>
+              <w:left w:val="single" w:sz="4" w:space="0" w:color="888888"/>
+              <w:right w:val="single" w:sz="4" w:space="0" w:color="888888"/>
+              <w:insideH w:val="single" w:sz="4" w:space="0" w:color="888888"/>
+              <w:insideV w:val="single" w:sz="4" w:space="0" w:color="888888"/>
+            </w:tcBorders>
+          </w:tcPr>
+          <w:p>
+            <w:r>
+              <w:rPr>
+                <w:sz w:val="16"/>
+              </w:rPr>
+              <w:t>2</w:t>
+            </w:r>
+          </w:p>
+        </w:tc>
+        <w:tc>
+          <w:tcPr>
+            <w:tcW w:type="dxa" w:w="2340"/>
+            <w:tcBorders>
+              <w:top w:val="single" w:sz="4" w:space="0" w:color="888888"/>
+              <w:bottom w:val="single" w:sz="4" w:space="0" w:color="888888"/>
+              <w:left w:val="single" w:sz="4" w:space="0" w:color="888888"/>
+              <w:right w:val="single" w:sz="4" w:space="0" w:color="888888"/>
+              <w:insideH w:val="single" w:sz="4" w:space="0" w:color="888888"/>
+              <w:insideV w:val="single" w:sz="4" w:space="0" w:color="888888"/>
+            </w:tcBorders>
+          </w:tcPr>
+          <w:p>
+            <w:r>
+              <w:rPr>
+                <w:sz w:val="16"/>
+              </w:rPr>
+              <w:t>Blink reflex protects; visible only</w:t>
+            </w:r>
+          </w:p>
+        </w:tc>
+        <w:tc>
+          <w:tcPr>
+            <w:tcW w:type="dxa" w:w="2340"/>
+            <w:tcBorders>
+              <w:top w:val="single" w:sz="4" w:space="0" w:color="888888"/>
+              <w:bottom w:val="single" w:sz="4" w:space="0" w:color="888888"/>
+              <w:left w:val="single" w:sz="4" w:space="0" w:color="888888"/>
+              <w:right w:val="single" w:sz="4" w:space="0" w:color="888888"/>
+              <w:insideH w:val="single" w:sz="4" w:space="0" w:color="888888"/>
+              <w:insideV w:val="single" w:sz="4" w:space="0" w:color="888888"/>
+            </w:tcBorders>
+          </w:tcPr>
+          <w:p>
+            <w:r>
+              <w:rPr>
+                <w:sz w:val="16"/>
+              </w:rPr>
+              <w:t>&lt;1 mW CW, visible</w:t>
+            </w:r>
+          </w:p>
+        </w:tc>
+        <w:tc>
+          <w:tcPr>
+            <w:tcW w:type="dxa" w:w="2340"/>
+            <w:tcBorders>
+              <w:top w:val="single" w:sz="4" w:space="0" w:color="888888"/>
+              <w:bottom w:val="single" w:sz="4" w:space="0" w:color="888888"/>
+              <w:left w:val="single" w:sz="4" w:space="0" w:color="888888"/>
+              <w:right w:val="single" w:sz="4" w:space="0" w:color="888888"/>
+              <w:insideH w:val="single" w:sz="4" w:space="0" w:color="888888"/>
+              <w:insideV w:val="single" w:sz="4" w:space="0" w:color="888888"/>
+            </w:tcBorders>
+          </w:tcPr>
+          <w:p>
+            <w:r>
+              <w:rPr>
+                <w:sz w:val="16"/>
+              </w:rPr>
+              <w:t>Low-power laser pointers, barcode scanners</w:t>
+            </w:r>
+          </w:p>
+        </w:tc>
+      </w:tr>
+      <w:tr>
+        <w:tc>
+          <w:tcPr>
+            <w:tcW w:type="dxa" w:w="2340"/>
+            <w:tcBorders>
+              <w:top w:val="single" w:sz="4" w:space="0" w:color="888888"/>
+              <w:bottom w:val="single" w:sz="4" w:space="0" w:color="888888"/>
+              <w:left w:val="single" w:sz="4" w:space="0" w:color="888888"/>
+              <w:right w:val="single" w:sz="4" w:space="0" w:color="888888"/>
+              <w:insideH w:val="single" w:sz="4" w:space="0" w:color="888888"/>
+              <w:insideV w:val="single" w:sz="4" w:space="0" w:color="888888"/>
+            </w:tcBorders>
+            <w:shd w:val="clear" w:color="auto" w:fill="F2F7FD"/>
+          </w:tcPr>
+          <w:p>
+            <w:r>
+              <w:rPr>
+                <w:sz w:val="16"/>
+              </w:rPr>
+              <w:t>2M</w:t>
+            </w:r>
+          </w:p>
+        </w:tc>
+        <w:tc>
+          <w:tcPr>
+            <w:tcW w:type="dxa" w:w="2340"/>
+            <w:tcBorders>
+              <w:top w:val="single" w:sz="4" w:space="0" w:color="888888"/>
+              <w:bottom w:val="single" w:sz="4" w:space="0" w:color="888888"/>
+              <w:left w:val="single" w:sz="4" w:space="0" w:color="888888"/>
+              <w:right w:val="single" w:sz="4" w:space="0" w:color="888888"/>
+              <w:insideH w:val="single" w:sz="4" w:space="0" w:color="888888"/>
+              <w:insideV w:val="single" w:sz="4" w:space="0" w:color="888888"/>
+            </w:tcBorders>
+            <w:shd w:val="clear" w:color="auto" w:fill="F2F7FD"/>
+          </w:tcPr>
+          <w:p>
+            <w:r>
+              <w:rPr>
+                <w:sz w:val="16"/>
+              </w:rPr>
+              <w:t>Safe without optics; blink protects</w:t>
+            </w:r>
+          </w:p>
+        </w:tc>
+        <w:tc>
+          <w:tcPr>
+            <w:tcW w:type="dxa" w:w="2340"/>
+            <w:tcBorders>
+              <w:top w:val="single" w:sz="4" w:space="0" w:color="888888"/>
+              <w:bottom w:val="single" w:sz="4" w:space="0" w:color="888888"/>
+              <w:left w:val="single" w:sz="4" w:space="0" w:color="888888"/>
+              <w:right w:val="single" w:sz="4" w:space="0" w:color="888888"/>
+              <w:insideH w:val="single" w:sz="4" w:space="0" w:color="888888"/>
+              <w:insideV w:val="single" w:sz="4" w:space="0" w:color="888888"/>
+            </w:tcBorders>
+            <w:shd w:val="clear" w:color="auto" w:fill="F2F7FD"/>
+          </w:tcPr>
+          <w:p>
+            <w:r>
+              <w:rPr>
+                <w:sz w:val="16"/>
+              </w:rPr>
+              <w:t>Low divergence, visible</w:t>
+            </w:r>
+          </w:p>
+        </w:tc>
+        <w:tc>
+          <w:tcPr>
+            <w:tcW w:type="dxa" w:w="2340"/>
+            <w:tcBorders>
+              <w:top w:val="single" w:sz="4" w:space="0" w:color="888888"/>
+              <w:bottom w:val="single" w:sz="4" w:space="0" w:color="888888"/>
+              <w:left w:val="single" w:sz="4" w:space="0" w:color="888888"/>
+              <w:right w:val="single" w:sz="4" w:space="0" w:color="888888"/>
+              <w:insideH w:val="single" w:sz="4" w:space="0" w:color="888888"/>
+              <w:insideV w:val="single" w:sz="4" w:space="0" w:color="888888"/>
+            </w:tcBorders>
+            <w:shd w:val="clear" w:color="auto" w:fill="F2F7FD"/>
+          </w:tcPr>
+          <w:p>
+            <w:r>
+              <w:rPr>
+                <w:sz w:val="16"/>
+              </w:rPr>
+              <w:t>Survey / levelling instruments</w:t>
+            </w:r>
+          </w:p>
+        </w:tc>
+      </w:tr>
+      <w:tr>
+        <w:tc>
+          <w:tcPr>
+            <w:tcW w:type="dxa" w:w="2340"/>
+            <w:tcBorders>
+              <w:top w:val="single" w:sz="4" w:space="0" w:color="888888"/>
+              <w:bottom w:val="single" w:sz="4" w:space="0" w:color="888888"/>
+              <w:left w:val="single" w:sz="4" w:space="0" w:color="888888"/>
+              <w:right w:val="single" w:sz="4" w:space="0" w:color="888888"/>
+              <w:insideH w:val="single" w:sz="4" w:space="0" w:color="888888"/>
+              <w:insideV w:val="single" w:sz="4" w:space="0" w:color="888888"/>
+            </w:tcBorders>
+          </w:tcPr>
+          <w:p>
+            <w:r>
+              <w:rPr>
+                <w:sz w:val="16"/>
+              </w:rPr>
+              <w:t>3R</w:t>
+            </w:r>
+          </w:p>
+        </w:tc>
+        <w:tc>
+          <w:tcPr>
+            <w:tcW w:type="dxa" w:w="2340"/>
+            <w:tcBorders>
+              <w:top w:val="single" w:sz="4" w:space="0" w:color="888888"/>
+              <w:bottom w:val="single" w:sz="4" w:space="0" w:color="888888"/>
+              <w:left w:val="single" w:sz="4" w:space="0" w:color="888888"/>
+              <w:right w:val="single" w:sz="4" w:space="0" w:color="888888"/>
+              <w:insideH w:val="single" w:sz="4" w:space="0" w:color="888888"/>
+              <w:insideV w:val="single" w:sz="4" w:space="0" w:color="888888"/>
+            </w:tcBorders>
+          </w:tcPr>
+          <w:p>
+            <w:r>
+              <w:rPr>
+                <w:sz w:val="16"/>
+              </w:rPr>
+              <w:t>Low risk; possible eye hazard</w:t>
+            </w:r>
+          </w:p>
+        </w:tc>
+        <w:tc>
+          <w:tcPr>
+            <w:tcW w:type="dxa" w:w="2340"/>
+            <w:tcBorders>
+              <w:top w:val="single" w:sz="4" w:space="0" w:color="888888"/>
+              <w:bottom w:val="single" w:sz="4" w:space="0" w:color="888888"/>
+              <w:left w:val="single" w:sz="4" w:space="0" w:color="888888"/>
+              <w:right w:val="single" w:sz="4" w:space="0" w:color="888888"/>
+              <w:insideH w:val="single" w:sz="4" w:space="0" w:color="888888"/>
+              <w:insideV w:val="single" w:sz="4" w:space="0" w:color="888888"/>
+            </w:tcBorders>
+          </w:tcPr>
+          <w:p>
+            <w:r>
+              <w:rPr>
+                <w:sz w:val="16"/>
+              </w:rPr>
+              <w:t>1–5 mW (visible CW)</w:t>
+            </w:r>
+          </w:p>
+        </w:tc>
+        <w:tc>
+          <w:tcPr>
+            <w:tcW w:type="dxa" w:w="2340"/>
+            <w:tcBorders>
+              <w:top w:val="single" w:sz="4" w:space="0" w:color="888888"/>
+              <w:bottom w:val="single" w:sz="4" w:space="0" w:color="888888"/>
+              <w:left w:val="single" w:sz="4" w:space="0" w:color="888888"/>
+              <w:right w:val="single" w:sz="4" w:space="0" w:color="888888"/>
+              <w:insideH w:val="single" w:sz="4" w:space="0" w:color="888888"/>
+              <w:insideV w:val="single" w:sz="4" w:space="0" w:color="888888"/>
+            </w:tcBorders>
+          </w:tcPr>
+          <w:p>
+            <w:r>
+              <w:rPr>
+                <w:sz w:val="16"/>
+              </w:rPr>
+              <w:t>Commercial laser pointers</w:t>
+            </w:r>
+          </w:p>
+        </w:tc>
+      </w:tr>
+      <w:tr>
+        <w:tc>
+          <w:tcPr>
+            <w:tcW w:type="dxa" w:w="2340"/>
+            <w:tcBorders>
+              <w:top w:val="single" w:sz="4" w:space="0" w:color="888888"/>
+              <w:bottom w:val="single" w:sz="4" w:space="0" w:color="888888"/>
+              <w:left w:val="single" w:sz="4" w:space="0" w:color="888888"/>
+              <w:right w:val="single" w:sz="4" w:space="0" w:color="888888"/>
+              <w:insideH w:val="single" w:sz="4" w:space="0" w:color="888888"/>
+              <w:insideV w:val="single" w:sz="4" w:space="0" w:color="888888"/>
+            </w:tcBorders>
+            <w:shd w:val="clear" w:color="auto" w:fill="F2F7FD"/>
+          </w:tcPr>
+          <w:p>
+            <w:r>
+              <w:rPr>
+                <w:sz w:val="16"/>
+              </w:rPr>
+              <w:t>3B</w:t>
+            </w:r>
+          </w:p>
+        </w:tc>
+        <w:tc>
+          <w:tcPr>
+            <w:tcW w:type="dxa" w:w="2340"/>
+            <w:tcBorders>
+              <w:top w:val="single" w:sz="4" w:space="0" w:color="888888"/>
+              <w:bottom w:val="single" w:sz="4" w:space="0" w:color="888888"/>
+              <w:left w:val="single" w:sz="4" w:space="0" w:color="888888"/>
+              <w:right w:val="single" w:sz="4" w:space="0" w:color="888888"/>
+              <w:insideH w:val="single" w:sz="4" w:space="0" w:color="888888"/>
+              <w:insideV w:val="single" w:sz="4" w:space="0" w:color="888888"/>
+            </w:tcBorders>
+            <w:shd w:val="clear" w:color="auto" w:fill="F2F7FD"/>
+          </w:tcPr>
+          <w:p>
+            <w:r>
+              <w:rPr>
+                <w:sz w:val="16"/>
+              </w:rPr>
+              <w:t>Direct or specular-reflection hazard</w:t>
+            </w:r>
+          </w:p>
+        </w:tc>
+        <w:tc>
+          <w:tcPr>
+            <w:tcW w:type="dxa" w:w="2340"/>
+            <w:tcBorders>
+              <w:top w:val="single" w:sz="4" w:space="0" w:color="888888"/>
+              <w:bottom w:val="single" w:sz="4" w:space="0" w:color="888888"/>
+              <w:left w:val="single" w:sz="4" w:space="0" w:color="888888"/>
+              <w:right w:val="single" w:sz="4" w:space="0" w:color="888888"/>
+              <w:insideH w:val="single" w:sz="4" w:space="0" w:color="888888"/>
+              <w:insideV w:val="single" w:sz="4" w:space="0" w:color="888888"/>
+            </w:tcBorders>
+            <w:shd w:val="clear" w:color="auto" w:fill="F2F7FD"/>
+          </w:tcPr>
+          <w:p>
+            <w:r>
+              <w:rPr>
+                <w:sz w:val="16"/>
+              </w:rPr>
+              <w:t>5–500 mW</w:t>
+            </w:r>
+          </w:p>
+        </w:tc>
+        <w:tc>
+          <w:tcPr>
+            <w:tcW w:type="dxa" w:w="2340"/>
+            <w:tcBorders>
+              <w:top w:val="single" w:sz="4" w:space="0" w:color="888888"/>
+              <w:bottom w:val="single" w:sz="4" w:space="0" w:color="888888"/>
+              <w:left w:val="single" w:sz="4" w:space="0" w:color="888888"/>
+              <w:right w:val="single" w:sz="4" w:space="0" w:color="888888"/>
+              <w:insideH w:val="single" w:sz="4" w:space="0" w:color="888888"/>
+              <w:insideV w:val="single" w:sz="4" w:space="0" w:color="888888"/>
+            </w:tcBorders>
+            <w:shd w:val="clear" w:color="auto" w:fill="F2F7FD"/>
+          </w:tcPr>
+          <w:p>
+            <w:r>
+              <w:rPr>
+                <w:sz w:val="16"/>
+              </w:rPr>
+              <w:t>Research lasers, laser shows</w:t>
+            </w:r>
+          </w:p>
+        </w:tc>
+      </w:tr>
+      <w:tr>
+        <w:tc>
+          <w:tcPr>
+            <w:tcW w:type="dxa" w:w="2340"/>
+            <w:tcBorders>
+              <w:top w:val="single" w:sz="4" w:space="0" w:color="888888"/>
+              <w:bottom w:val="single" w:sz="4" w:space="0" w:color="888888"/>
+              <w:left w:val="single" w:sz="4" w:space="0" w:color="888888"/>
+              <w:right w:val="single" w:sz="4" w:space="0" w:color="888888"/>
+              <w:insideH w:val="single" w:sz="4" w:space="0" w:color="888888"/>
+              <w:insideV w:val="single" w:sz="4" w:space="0" w:color="888888"/>
+            </w:tcBorders>
+          </w:tcPr>
+          <w:p>
+            <w:r>
+              <w:rPr>
+                <w:sz w:val="16"/>
+              </w:rPr>
+              <w:t>4</w:t>
+            </w:r>
+          </w:p>
+        </w:tc>
+        <w:tc>
+          <w:tcPr>
+            <w:tcW w:type="dxa" w:w="2340"/>
+            <w:tcBorders>
+              <w:top w:val="single" w:sz="4" w:space="0" w:color="888888"/>
+              <w:bottom w:val="single" w:sz="4" w:space="0" w:color="888888"/>
+              <w:left w:val="single" w:sz="4" w:space="0" w:color="888888"/>
+              <w:right w:val="single" w:sz="4" w:space="0" w:color="888888"/>
+              <w:insideH w:val="single" w:sz="4" w:space="0" w:color="888888"/>
+              <w:insideV w:val="single" w:sz="4" w:space="0" w:color="888888"/>
+            </w:tcBorders>
+          </w:tcPr>
+          <w:p>
+            <w:r>
+              <w:rPr>
+                <w:sz w:val="16"/>
+              </w:rPr>
+              <w:t>Eye &amp; skin hazard; fire risk</w:t>
+            </w:r>
+          </w:p>
+        </w:tc>
+        <w:tc>
+          <w:tcPr>
+            <w:tcW w:type="dxa" w:w="2340"/>
+            <w:tcBorders>
+              <w:top w:val="single" w:sz="4" w:space="0" w:color="888888"/>
+              <w:bottom w:val="single" w:sz="4" w:space="0" w:color="888888"/>
+              <w:left w:val="single" w:sz="4" w:space="0" w:color="888888"/>
+              <w:right w:val="single" w:sz="4" w:space="0" w:color="888888"/>
+              <w:insideH w:val="single" w:sz="4" w:space="0" w:color="888888"/>
+              <w:insideV w:val="single" w:sz="4" w:space="0" w:color="888888"/>
+            </w:tcBorders>
+          </w:tcPr>
+          <w:p>
+            <w:r>
+              <w:rPr>
+                <w:sz w:val="16"/>
+              </w:rPr>
+              <w:t>&gt;500 mW or high pulse energy</w:t>
+            </w:r>
+          </w:p>
+        </w:tc>
+        <w:tc>
+          <w:tcPr>
+            <w:tcW w:type="dxa" w:w="2340"/>
+            <w:tcBorders>
+              <w:top w:val="single" w:sz="4" w:space="0" w:color="888888"/>
+              <w:bottom w:val="single" w:sz="4" w:space="0" w:color="888888"/>
+              <w:left w:val="single" w:sz="4" w:space="0" w:color="888888"/>
+              <w:right w:val="single" w:sz="4" w:space="0" w:color="888888"/>
+              <w:insideH w:val="single" w:sz="4" w:space="0" w:color="888888"/>
+              <w:insideV w:val="single" w:sz="4" w:space="0" w:color="888888"/>
+            </w:tcBorders>
+          </w:tcPr>
+          <w:p>
+            <w:r>
+              <w:rPr>
+                <w:sz w:val="16"/>
+              </w:rPr>
+              <w:t>Industrial cutting, surgical lasers, DEW</w:t>
+            </w:r>
+          </w:p>
+        </w:tc>
+      </w:tr>
+    </w:tbl>
+    <w:p>
+      <w:pPr>
+        <w:jc w:val="center"/>
+      </w:pPr>
+      <w:r>
+        <w:rPr>
+          <w:i/>
+          <w:color w:val="444444"/>
+          <w:sz w:val="17"/>
+        </w:rPr>
+        <w:t>Table 3: IEC 60825-1 / ANSI Z136.1 laser hazard classification summary.</w:t>
+      </w:r>
+    </w:p>
+    <w:p>
+      <w:pPr>
+        <w:spacing w:before="0" w:after="80"/>
+      </w:pPr>
     </w:p>
     <w:p>
       <w:pPr>

</xml_diff>